<commit_message>
Agregué las páginas del Administrador para películas y usuarios
</commit_message>
<xml_diff>
--- a/CRONOGRAMA.docx
+++ b/CRONOGRAMA.docx
@@ -1,11 +1,12 @@
 
 <file path=word/document.xml><?xml version="1.0" encoding="utf-8"?>
-<w:document xmlns:wpc="http://schemas.microsoft.com/office/word/2010/wordprocessingCanvas" xmlns:cx="http://schemas.microsoft.com/office/drawing/2014/chartex" xmlns:cx1="http://schemas.microsoft.com/office/drawing/2015/9/8/chartex" xmlns:cx2="http://schemas.microsoft.com/office/drawing/2015/10/21/chartex" xmlns:cx3="http://schemas.microsoft.com/office/drawing/2016/5/9/chartex" xmlns:cx4="http://schemas.microsoft.com/office/drawing/2016/5/10/chartex" xmlns:cx5="http://schemas.microsoft.com/office/drawing/2016/5/11/chartex" xmlns:cx6="http://schemas.microsoft.com/office/drawing/2016/5/12/chartex" xmlns:cx7="http://schemas.microsoft.com/office/drawing/2016/5/13/chartex" xmlns:cx8="http://schemas.microsoft.com/office/drawing/2016/5/14/chartex" xmlns:mc="http://schemas.openxmlformats.org/markup-compatibility/2006" xmlns:aink="http://schemas.microsoft.com/office/drawing/2016/ink" xmlns:am3d="http://schemas.microsoft.com/office/drawing/2017/model3d" xmlns:o="urn:schemas-microsoft-com:office:office" xmlns:oel="http://schemas.microsoft.com/office/2019/extlst" xmlns:r="http://schemas.openxmlformats.org/officeDocument/2006/relationships" xmlns:m="http://schemas.openxmlformats.org/officeDocument/2006/math" xmlns:v="urn:schemas-microsoft-com:vml" xmlns:wp14="http://schemas.microsoft.com/office/word/2010/wordprocessingDrawing" xmlns:wp="http://schemas.openxmlformats.org/drawingml/2006/wordprocessingDrawing" xmlns:w10="urn:schemas-microsoft-com:office:word" xmlns:w="http://schemas.openxmlformats.org/wordprocessingml/2006/main" xmlns:w14="http://schemas.microsoft.com/office/word/2010/wordml" xmlns:w15="http://schemas.microsoft.com/office/word/2012/wordml" xmlns:w16cex="http://schemas.microsoft.com/office/word/2018/wordml/cex" xmlns:w16cid="http://schemas.microsoft.com/office/word/2016/wordml/cid" xmlns:w16="http://schemas.microsoft.com/office/word/2018/wordml" xmlns:w16du="http://schemas.microsoft.com/office/word/2023/wordml/word16du" xmlns:w16sdtdh="http://schemas.microsoft.com/office/word/2020/wordml/sdtdatahash" xmlns:w16se="http://schemas.microsoft.com/office/word/2015/wordml/symex" xmlns:wpg="http://schemas.microsoft.com/office/word/2010/wordprocessingGroup" xmlns:wpi="http://schemas.microsoft.com/office/word/2010/wordprocessingInk" xmlns:wne="http://schemas.microsoft.com/office/word/2006/wordml" xmlns:wps="http://schemas.microsoft.com/office/word/2010/wordprocessingShape" mc:Ignorable="w14 w15 w16se w16cid w16 w16cex w16sdtdh w16du wp14">
+<w:document xmlns:wpc="http://schemas.microsoft.com/office/word/2010/wordprocessingCanvas" xmlns:cx="http://schemas.microsoft.com/office/drawing/2014/chartex" xmlns:mc="http://schemas.openxmlformats.org/markup-compatibility/2006" xmlns:o="urn:schemas-microsoft-com:office:office" xmlns:r="http://schemas.openxmlformats.org/officeDocument/2006/relationships" xmlns:m="http://schemas.openxmlformats.org/officeDocument/2006/math" xmlns:v="urn:schemas-microsoft-com:vml" xmlns:wp14="http://schemas.microsoft.com/office/word/2010/wordprocessingDrawing" xmlns:wp="http://schemas.openxmlformats.org/drawingml/2006/wordprocessingDrawing" xmlns:w10="urn:schemas-microsoft-com:office:word" xmlns:w="http://schemas.openxmlformats.org/wordprocessingml/2006/main" xmlns:w14="http://schemas.microsoft.com/office/word/2010/wordml" xmlns:w15="http://schemas.microsoft.com/office/word/2012/wordml" xmlns:w16se="http://schemas.microsoft.com/office/word/2015/wordml/symex" xmlns:wpg="http://schemas.microsoft.com/office/word/2010/wordprocessingGroup" xmlns:wpi="http://schemas.microsoft.com/office/word/2010/wordprocessingInk" xmlns:wne="http://schemas.microsoft.com/office/word/2006/wordml" xmlns:wps="http://schemas.microsoft.com/office/word/2010/wordprocessingShape" mc:Ignorable="w14 w15 w16se wp14">
   <w:body>
     <w:p>
       <w:r>
         <w:rPr>
           <w:noProof/>
+          <w:lang w:val="es-GT" w:eastAsia="es-GT" w:bidi="ar-SA"/>
         </w:rPr>
         <mc:AlternateContent>
           <mc:Choice Requires="wps">
@@ -84,7 +85,7 @@
               </wp:anchor>
             </w:drawing>
           </mc:Choice>
-          <mc:Fallback>
+          <mc:Fallback xmlns:w16sdtdh="http://schemas.microsoft.com/office/word/2020/wordml/sdtdatahash" xmlns:w16du="http://schemas.microsoft.com/office/word/2023/wordml/word16du" xmlns:w16="http://schemas.microsoft.com/office/word/2018/wordml" xmlns:w16cid="http://schemas.microsoft.com/office/word/2016/wordml/cid" xmlns:w16cex="http://schemas.microsoft.com/office/word/2018/wordml/cex" xmlns:oel="http://schemas.microsoft.com/office/2019/extlst" xmlns:am3d="http://schemas.microsoft.com/office/drawing/2017/model3d" xmlns:aink="http://schemas.microsoft.com/office/drawing/2016/ink" xmlns:cx8="http://schemas.microsoft.com/office/drawing/2016/5/14/chartex" xmlns:cx7="http://schemas.microsoft.com/office/drawing/2016/5/13/chartex" xmlns:cx6="http://schemas.microsoft.com/office/drawing/2016/5/12/chartex" xmlns:cx5="http://schemas.microsoft.com/office/drawing/2016/5/11/chartex" xmlns:cx4="http://schemas.microsoft.com/office/drawing/2016/5/10/chartex" xmlns:cx3="http://schemas.microsoft.com/office/drawing/2016/5/9/chartex" xmlns:cx2="http://schemas.microsoft.com/office/drawing/2015/10/21/chartex" xmlns:cx1="http://schemas.microsoft.com/office/drawing/2015/9/8/chartex">
             <w:pict>
               <v:shapetype w14:anchorId="4D3B9F36" id="_x0000_t202" coordsize="21600,21600" o:spt="202" path="m,l,21600r21600,l21600,xe">
                 <v:stroke joinstyle="miter"/>
@@ -129,6 +130,7 @@
       <w:r>
         <w:rPr>
           <w:noProof/>
+          <w:lang w:val="es-GT" w:eastAsia="es-GT" w:bidi="ar-SA"/>
         </w:rPr>
         <mc:AlternateContent>
           <mc:Choice Requires="wps">
@@ -222,7 +224,7 @@
               </wp:anchor>
             </w:drawing>
           </mc:Choice>
-          <mc:Fallback>
+          <mc:Fallback xmlns:w16sdtdh="http://schemas.microsoft.com/office/word/2020/wordml/sdtdatahash" xmlns:w16du="http://schemas.microsoft.com/office/word/2023/wordml/word16du" xmlns:w16="http://schemas.microsoft.com/office/word/2018/wordml" xmlns:w16cid="http://schemas.microsoft.com/office/word/2016/wordml/cid" xmlns:w16cex="http://schemas.microsoft.com/office/word/2018/wordml/cex" xmlns:oel="http://schemas.microsoft.com/office/2019/extlst" xmlns:am3d="http://schemas.microsoft.com/office/drawing/2017/model3d" xmlns:aink="http://schemas.microsoft.com/office/drawing/2016/ink" xmlns:cx8="http://schemas.microsoft.com/office/drawing/2016/5/14/chartex" xmlns:cx7="http://schemas.microsoft.com/office/drawing/2016/5/13/chartex" xmlns:cx6="http://schemas.microsoft.com/office/drawing/2016/5/12/chartex" xmlns:cx5="http://schemas.microsoft.com/office/drawing/2016/5/11/chartex" xmlns:cx4="http://schemas.microsoft.com/office/drawing/2016/5/10/chartex" xmlns:cx3="http://schemas.microsoft.com/office/drawing/2016/5/9/chartex" xmlns:cx2="http://schemas.microsoft.com/office/drawing/2015/10/21/chartex" xmlns:cx1="http://schemas.microsoft.com/office/drawing/2015/9/8/chartex">
             <w:pict>
               <v:rect w14:anchorId="11092EB7" id="Rectangle 17" o:spid="_x0000_s1027" style="position:absolute;margin-left:1.05pt;margin-top:75pt;width:412.95pt;height:97.75pt;z-index:251659264;visibility:visible;mso-wrap-style:square;mso-width-percent:0;mso-height-percent:0;mso-wrap-distance-left:0;mso-wrap-distance-top:0;mso-wrap-distance-right:0;mso-wrap-distance-bottom:0;mso-position-horizontal:absolute;mso-position-horizontal-relative:margin;mso-position-vertical:absolute;mso-position-vertical-relative:page;mso-width-percent:0;mso-height-percent:0;mso-width-relative:margin;mso-height-relative:margin;v-text-anchor:top" o:gfxdata="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" filled="f" stroked="f">
                 <v:shadow on="t" color="#143c3c" origin=",.5" offset="1.01mm,1.01mm"/>
@@ -274,6 +276,7 @@
       <w:r>
         <w:rPr>
           <w:noProof/>
+          <w:lang w:val="es-GT" w:eastAsia="es-GT" w:bidi="ar-SA"/>
         </w:rPr>
         <mc:AlternateContent>
           <mc:Choice Requires="wps">
@@ -343,7 +346,7 @@
               </wp:anchor>
             </w:drawing>
           </mc:Choice>
-          <mc:Fallback>
+          <mc:Fallback xmlns:w16sdtdh="http://schemas.microsoft.com/office/word/2020/wordml/sdtdatahash" xmlns:w16du="http://schemas.microsoft.com/office/word/2023/wordml/word16du" xmlns:w16="http://schemas.microsoft.com/office/word/2018/wordml" xmlns:w16cid="http://schemas.microsoft.com/office/word/2016/wordml/cid" xmlns:w16cex="http://schemas.microsoft.com/office/word/2018/wordml/cex" xmlns:oel="http://schemas.microsoft.com/office/2019/extlst" xmlns:am3d="http://schemas.microsoft.com/office/drawing/2017/model3d" xmlns:aink="http://schemas.microsoft.com/office/drawing/2016/ink" xmlns:cx8="http://schemas.microsoft.com/office/drawing/2016/5/14/chartex" xmlns:cx7="http://schemas.microsoft.com/office/drawing/2016/5/13/chartex" xmlns:cx6="http://schemas.microsoft.com/office/drawing/2016/5/12/chartex" xmlns:cx5="http://schemas.microsoft.com/office/drawing/2016/5/11/chartex" xmlns:cx4="http://schemas.microsoft.com/office/drawing/2016/5/10/chartex" xmlns:cx3="http://schemas.microsoft.com/office/drawing/2016/5/9/chartex" xmlns:cx2="http://schemas.microsoft.com/office/drawing/2015/10/21/chartex" xmlns:cx1="http://schemas.microsoft.com/office/drawing/2015/9/8/chartex">
             <w:pict>
               <v:rect w14:anchorId="739947F8" id="Rectangle 4" o:spid="_x0000_s1026" style="position:absolute;margin-left:-62.45pt;margin-top:-62.65pt;width:687.75pt;height:845.6pt;z-index:-251650048;visibility:visible;mso-wrap-style:square;mso-height-percent:0;mso-wrap-distance-left:9pt;mso-wrap-distance-top:0;mso-wrap-distance-right:9pt;mso-wrap-distance-bottom:0;mso-position-horizontal:absolute;mso-position-horizontal-relative:margin;mso-position-vertical:absolute;mso-position-vertical-relative:text;mso-height-percent:0;mso-height-relative:margin;v-text-anchor:middle" o:gfxdata="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" fillcolor="#f2f2f2 [3052]" stroked="f" strokeweight="1pt">
                 <w10:wrap anchorx="margin"/>
@@ -357,6 +360,7 @@
       <w:r>
         <w:rPr>
           <w:noProof/>
+          <w:lang w:val="es-GT" w:eastAsia="es-GT" w:bidi="ar-SA"/>
         </w:rPr>
         <mc:AlternateContent>
           <mc:Choice Requires="wps">
@@ -448,7 +452,7 @@
               </wp:anchor>
             </w:drawing>
           </mc:Choice>
-          <mc:Fallback>
+          <mc:Fallback xmlns:w16sdtdh="http://schemas.microsoft.com/office/word/2020/wordml/sdtdatahash" xmlns:w16du="http://schemas.microsoft.com/office/word/2023/wordml/word16du" xmlns:w16="http://schemas.microsoft.com/office/word/2018/wordml" xmlns:w16cid="http://schemas.microsoft.com/office/word/2016/wordml/cid" xmlns:w16cex="http://schemas.microsoft.com/office/word/2018/wordml/cex" xmlns:oel="http://schemas.microsoft.com/office/2019/extlst" xmlns:am3d="http://schemas.microsoft.com/office/drawing/2017/model3d" xmlns:aink="http://schemas.microsoft.com/office/drawing/2016/ink" xmlns:cx8="http://schemas.microsoft.com/office/drawing/2016/5/14/chartex" xmlns:cx7="http://schemas.microsoft.com/office/drawing/2016/5/13/chartex" xmlns:cx6="http://schemas.microsoft.com/office/drawing/2016/5/12/chartex" xmlns:cx5="http://schemas.microsoft.com/office/drawing/2016/5/11/chartex" xmlns:cx4="http://schemas.microsoft.com/office/drawing/2016/5/10/chartex" xmlns:cx3="http://schemas.microsoft.com/office/drawing/2016/5/9/chartex" xmlns:cx2="http://schemas.microsoft.com/office/drawing/2015/10/21/chartex" xmlns:cx1="http://schemas.microsoft.com/office/drawing/2015/9/8/chartex">
             <w:pict>
               <v:shape w14:anchorId="6503FE1F" id="_x0000_s1028" type="#_x0000_t202" style="position:absolute;margin-left:1.35pt;margin-top:223.55pt;width:456.7pt;height:81.65pt;z-index:251663360;visibility:visible;mso-wrap-style:square;mso-width-percent:0;mso-height-percent:0;mso-wrap-distance-left:9pt;mso-wrap-distance-top:0;mso-wrap-distance-right:9pt;mso-wrap-distance-bottom:0;mso-position-horizontal:absolute;mso-position-horizontal-relative:text;mso-position-vertical:absolute;mso-position-vertical-relative:page;mso-width-percent:0;mso-height-percent:0;mso-width-relative:margin;mso-height-relative:margin;v-text-anchor:top" o:gfxdata="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" filled="f" stroked="f" strokeweight=".5pt">
                 <v:textbox>
@@ -506,6 +510,7 @@
       <w:r>
         <w:rPr>
           <w:noProof/>
+          <w:lang w:val="es-GT" w:eastAsia="es-GT" w:bidi="ar-SA"/>
         </w:rPr>
         <mc:AlternateContent>
           <mc:Choice Requires="wps">
@@ -570,7 +575,7 @@
               </wp:anchor>
             </w:drawing>
           </mc:Choice>
-          <mc:Fallback>
+          <mc:Fallback xmlns:w16sdtdh="http://schemas.microsoft.com/office/word/2020/wordml/sdtdatahash" xmlns:w16du="http://schemas.microsoft.com/office/word/2023/wordml/word16du" xmlns:w16="http://schemas.microsoft.com/office/word/2018/wordml" xmlns:w16cid="http://schemas.microsoft.com/office/word/2016/wordml/cid" xmlns:w16cex="http://schemas.microsoft.com/office/word/2018/wordml/cex" xmlns:oel="http://schemas.microsoft.com/office/2019/extlst" xmlns:am3d="http://schemas.microsoft.com/office/drawing/2017/model3d" xmlns:aink="http://schemas.microsoft.com/office/drawing/2016/ink" xmlns:cx8="http://schemas.microsoft.com/office/drawing/2016/5/14/chartex" xmlns:cx7="http://schemas.microsoft.com/office/drawing/2016/5/13/chartex" xmlns:cx6="http://schemas.microsoft.com/office/drawing/2016/5/12/chartex" xmlns:cx5="http://schemas.microsoft.com/office/drawing/2016/5/11/chartex" xmlns:cx4="http://schemas.microsoft.com/office/drawing/2016/5/10/chartex" xmlns:cx3="http://schemas.microsoft.com/office/drawing/2016/5/9/chartex" xmlns:cx2="http://schemas.microsoft.com/office/drawing/2015/10/21/chartex" xmlns:cx1="http://schemas.microsoft.com/office/drawing/2015/9/8/chartex">
             <w:pict>
               <v:rect w14:anchorId="7A63B8B3" id="Rectangle 5" o:spid="_x0000_s1026" style="position:absolute;margin-left:1.05pt;margin-top:353.4pt;width:348.15pt;height:5.35pt;z-index:251664384;visibility:visible;mso-wrap-style:square;mso-wrap-distance-left:9pt;mso-wrap-distance-top:0;mso-wrap-distance-right:9pt;mso-wrap-distance-bottom:0;mso-position-horizontal:absolute;mso-position-horizontal-relative:text;mso-position-vertical:absolute;mso-position-vertical-relative:page;v-text-anchor:middle" o:gfxdata="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" fillcolor="#f9a826" stroked="f" strokeweight="1pt">
                 <w10:wrap type="topAndBottom" anchory="page"/>
@@ -582,6 +587,7 @@
       <w:r>
         <w:rPr>
           <w:noProof/>
+          <w:lang w:val="es-GT" w:eastAsia="es-GT" w:bidi="ar-SA"/>
         </w:rPr>
         <w:drawing>
           <wp:anchor distT="0" distB="0" distL="114300" distR="114300" simplePos="0" relativeHeight="251668480" behindDoc="0" locked="0" layoutInCell="1" allowOverlap="1" wp14:anchorId="5E33CBE4" wp14:editId="0CD675AF">
@@ -607,13 +613,13 @@
                     <pic:cNvPicPr/>
                   </pic:nvPicPr>
                   <pic:blipFill>
-                    <a:blip r:embed="rId4">
+                    <a:blip r:embed="rId4" cstate="print">
                       <a:extLst>
                         <a:ext uri="{28A0092B-C50C-407E-A947-70E740481C1C}">
                           <a14:useLocalDpi xmlns:a14="http://schemas.microsoft.com/office/drawing/2010/main" val="0"/>
                         </a:ext>
                         <a:ext uri="{96DAC541-7B7A-43D3-8B79-37D633B846F1}">
-                          <asvg:svgBlip xmlns:asvg="http://schemas.microsoft.com/office/drawing/2016/SVG/main" r:embed="rId5"/>
+                          <asvg:svgBlip xmlns:asvg="http://schemas.microsoft.com/office/drawing/2016/SVG/main" xmlns:w16sdtdh="http://schemas.microsoft.com/office/word/2020/wordml/sdtdatahash" xmlns:w16du="http://schemas.microsoft.com/office/word/2023/wordml/word16du" xmlns:w16="http://schemas.microsoft.com/office/word/2018/wordml" xmlns:w16cid="http://schemas.microsoft.com/office/word/2016/wordml/cid" xmlns:w16cex="http://schemas.microsoft.com/office/word/2018/wordml/cex" xmlns:w="http://schemas.openxmlformats.org/wordprocessingml/2006/main" xmlns:w10="urn:schemas-microsoft-com:office:word" xmlns:v="urn:schemas-microsoft-com:vml" xmlns:oel="http://schemas.microsoft.com/office/2019/extlst" xmlns:o="urn:schemas-microsoft-com:office:office" xmlns:am3d="http://schemas.microsoft.com/office/drawing/2017/model3d" xmlns:aink="http://schemas.microsoft.com/office/drawing/2016/ink" xmlns:cx8="http://schemas.microsoft.com/office/drawing/2016/5/14/chartex" xmlns:cx7="http://schemas.microsoft.com/office/drawing/2016/5/13/chartex" xmlns:cx6="http://schemas.microsoft.com/office/drawing/2016/5/12/chartex" xmlns:cx5="http://schemas.microsoft.com/office/drawing/2016/5/11/chartex" xmlns:cx4="http://schemas.microsoft.com/office/drawing/2016/5/10/chartex" xmlns:cx3="http://schemas.microsoft.com/office/drawing/2016/5/9/chartex" xmlns:cx2="http://schemas.microsoft.com/office/drawing/2015/10/21/chartex" xmlns:cx1="http://schemas.microsoft.com/office/drawing/2015/9/8/chartex" xmlns="" r:embed="rId5"/>
                         </a:ext>
                       </a:extLst>
                     </a:blip>
@@ -650,7 +656,7 @@
     <w:p/>
     <w:tbl>
       <w:tblPr>
-        <w:tblStyle w:val="Tablaconcuadrcula4-nfasis1"/>
+        <w:tblStyle w:val="Tabladecuadrcula4-nfasis1"/>
         <w:tblW w:w="0" w:type="auto"/>
         <w:jc w:val="center"/>
         <w:tblBorders>
@@ -751,10 +757,7 @@
               <w:cnfStyle w:val="000000100000" w:firstRow="0" w:lastRow="0" w:firstColumn="0" w:lastColumn="0" w:oddVBand="0" w:evenVBand="0" w:oddHBand="1" w:evenHBand="0" w:firstRowFirstColumn="0" w:firstRowLastColumn="0" w:lastRowFirstColumn="0" w:lastRowLastColumn="0"/>
             </w:pPr>
             <w:r>
-              <w:t>Creación</w:t>
-            </w:r>
-            <w:r>
-              <w:t xml:space="preserve"> del Backend usando el framework express</w:t>
+              <w:t>Creación del Backend usando el framework express</w:t>
             </w:r>
           </w:p>
         </w:tc>
@@ -1099,201 +1102,423 @@
     </w:p>
     <w:tbl>
       <w:tblPr>
-        <w:tblStyle w:val="Tablaconcuadrcula4-nfasis4"/>
-        <w:tblpPr w:leftFromText="141" w:rightFromText="141" w:horzAnchor="margin" w:tblpY="547"/>
+        <w:tblStyle w:val="Tabladecuadrcula4-nfasis1"/>
         <w:tblW w:w="0" w:type="auto"/>
+        <w:jc w:val="center"/>
         <w:tblBorders>
-          <w:top w:val="single" w:sz="12" w:space="0" w:color="000000" w:themeColor="text1"/>
-          <w:left w:val="single" w:sz="12" w:space="0" w:color="000000" w:themeColor="text1"/>
-          <w:bottom w:val="single" w:sz="12" w:space="0" w:color="000000" w:themeColor="text1"/>
-          <w:right w:val="single" w:sz="12" w:space="0" w:color="000000" w:themeColor="text1"/>
-          <w:insideH w:val="single" w:sz="12" w:space="0" w:color="000000" w:themeColor="text1"/>
-          <w:insideV w:val="single" w:sz="12" w:space="0" w:color="000000" w:themeColor="text1"/>
+          <w:top w:val="single" w:sz="12" w:space="0" w:color="156082" w:themeColor="accent1"/>
+          <w:left w:val="single" w:sz="12" w:space="0" w:color="156082" w:themeColor="accent1"/>
+          <w:bottom w:val="single" w:sz="12" w:space="0" w:color="156082" w:themeColor="accent1"/>
+          <w:right w:val="single" w:sz="12" w:space="0" w:color="156082" w:themeColor="accent1"/>
+          <w:insideH w:val="single" w:sz="12" w:space="0" w:color="156082" w:themeColor="accent1"/>
+          <w:insideV w:val="single" w:sz="12" w:space="0" w:color="156082" w:themeColor="accent1"/>
         </w:tblBorders>
         <w:tblLook w:val="04A0" w:firstRow="1" w:lastRow="0" w:firstColumn="1" w:lastColumn="0" w:noHBand="0" w:noVBand="1"/>
       </w:tblPr>
       <w:tblGrid>
-        <w:gridCol w:w="4397"/>
-        <w:gridCol w:w="4395"/>
+        <w:gridCol w:w="1310"/>
+        <w:gridCol w:w="6435"/>
+        <w:gridCol w:w="1083"/>
       </w:tblGrid>
       <w:tr>
         <w:trPr>
           <w:cnfStyle w:val="100000000000" w:firstRow="1" w:lastRow="0" w:firstColumn="0" w:lastColumn="0" w:oddVBand="0" w:evenVBand="0" w:oddHBand="0" w:evenHBand="0" w:firstRowFirstColumn="0" w:firstRowLastColumn="0" w:lastRowFirstColumn="0" w:lastRowLastColumn="0"/>
+          <w:jc w:val="center"/>
         </w:trPr>
         <w:tc>
           <w:tcPr>
             <w:cnfStyle w:val="001000000000" w:firstRow="0" w:lastRow="0" w:firstColumn="1" w:lastColumn="0" w:oddVBand="0" w:evenVBand="0" w:oddHBand="0" w:evenHBand="0" w:firstRowFirstColumn="0" w:firstRowLastColumn="0" w:lastRowFirstColumn="0" w:lastRowLastColumn="0"/>
-            <w:tcW w:w="8792" w:type="dxa"/>
+            <w:tcW w:w="0" w:type="auto"/>
+            <w:vAlign w:val="center"/>
+          </w:tcPr>
+          <w:p>
+            <w:pPr>
+              <w:jc w:val="center"/>
+            </w:pPr>
+          </w:p>
+        </w:tc>
+        <w:tc>
+          <w:tcPr>
+            <w:tcW w:w="0" w:type="auto"/>
             <w:gridSpan w:val="2"/>
-            <w:tcBorders>
-              <w:top w:val="single" w:sz="12" w:space="0" w:color="000000" w:themeColor="text1"/>
-              <w:left w:val="single" w:sz="12" w:space="0" w:color="000000" w:themeColor="text1"/>
-              <w:bottom w:val="single" w:sz="12" w:space="0" w:color="000000" w:themeColor="text1"/>
-              <w:right w:val="single" w:sz="12" w:space="0" w:color="000000" w:themeColor="text1"/>
-            </w:tcBorders>
-          </w:tcPr>
-          <w:p>
-            <w:pPr>
-              <w:jc w:val="center"/>
-            </w:pPr>
+            <w:vAlign w:val="center"/>
+          </w:tcPr>
+          <w:p>
+            <w:pPr>
+              <w:jc w:val="center"/>
+              <w:cnfStyle w:val="100000000000" w:firstRow="1" w:lastRow="0" w:firstColumn="0" w:lastColumn="0" w:oddVBand="0" w:evenVBand="0" w:oddHBand="0" w:evenHBand="0" w:firstRowFirstColumn="0" w:firstRowLastColumn="0" w:lastRowFirstColumn="0" w:lastRowLastColumn="0"/>
+            </w:pPr>
+            <w:r>
+              <w:t>Raúl Emanuel Yat Cancinos</w:t>
+            </w:r>
           </w:p>
         </w:tc>
       </w:tr>
       <w:tr>
         <w:trPr>
           <w:cnfStyle w:val="000000100000" w:firstRow="0" w:lastRow="0" w:firstColumn="0" w:lastColumn="0" w:oddVBand="0" w:evenVBand="0" w:oddHBand="1" w:evenHBand="0" w:firstRowFirstColumn="0" w:firstRowLastColumn="0" w:lastRowFirstColumn="0" w:lastRowLastColumn="0"/>
+          <w:jc w:val="center"/>
         </w:trPr>
         <w:tc>
           <w:tcPr>
             <w:cnfStyle w:val="001000000000" w:firstRow="0" w:lastRow="0" w:firstColumn="1" w:lastColumn="0" w:oddVBand="0" w:evenVBand="0" w:oddHBand="0" w:evenHBand="0" w:firstRowFirstColumn="0" w:firstRowLastColumn="0" w:lastRowFirstColumn="0" w:lastRowLastColumn="0"/>
-            <w:tcW w:w="4397" w:type="dxa"/>
-            <w:tcBorders>
-              <w:top w:val="single" w:sz="12" w:space="0" w:color="000000" w:themeColor="text1"/>
-            </w:tcBorders>
-          </w:tcPr>
-          <w:p>
-            <w:pPr>
-              <w:jc w:val="center"/>
-            </w:pPr>
-          </w:p>
-        </w:tc>
-        <w:tc>
-          <w:tcPr>
-            <w:tcW w:w="4395" w:type="dxa"/>
-            <w:tcBorders>
-              <w:top w:val="single" w:sz="12" w:space="0" w:color="000000" w:themeColor="text1"/>
-            </w:tcBorders>
+            <w:tcW w:w="0" w:type="auto"/>
+            <w:vAlign w:val="center"/>
+          </w:tcPr>
+          <w:p>
+            <w:pPr>
+              <w:jc w:val="center"/>
+            </w:pPr>
+            <w:r>
+              <w:t>21/06/2024</w:t>
+            </w:r>
+          </w:p>
+        </w:tc>
+        <w:tc>
+          <w:tcPr>
+            <w:tcW w:w="0" w:type="auto"/>
+            <w:vAlign w:val="center"/>
           </w:tcPr>
           <w:p>
             <w:pPr>
               <w:jc w:val="center"/>
               <w:cnfStyle w:val="000000100000" w:firstRow="0" w:lastRow="0" w:firstColumn="0" w:lastColumn="0" w:oddVBand="0" w:evenVBand="0" w:oddHBand="1" w:evenHBand="0" w:firstRowFirstColumn="0" w:firstRowLastColumn="0" w:lastRowFirstColumn="0" w:lastRowLastColumn="0"/>
             </w:pPr>
+            <w:r>
+              <w:t>Creación de la página raíz</w:t>
+            </w:r>
+          </w:p>
+        </w:tc>
+        <w:tc>
+          <w:tcPr>
+            <w:tcW w:w="0" w:type="auto"/>
+            <w:vAlign w:val="center"/>
+          </w:tcPr>
+          <w:p>
+            <w:pPr>
+              <w:jc w:val="center"/>
+              <w:cnfStyle w:val="000000100000" w:firstRow="0" w:lastRow="0" w:firstColumn="0" w:lastColumn="0" w:oddVBand="0" w:evenVBand="0" w:oddHBand="1" w:evenHBand="0" w:firstRowFirstColumn="0" w:firstRowLastColumn="0" w:lastRowFirstColumn="0" w:lastRowLastColumn="0"/>
+              <w:rPr>
+                <w:lang w:val="es-GT"/>
+              </w:rPr>
+            </w:pPr>
+            <w:proofErr w:type="spellStart"/>
+            <w:r>
+              <w:t>Frontend</w:t>
+            </w:r>
+            <w:proofErr w:type="spellEnd"/>
           </w:p>
         </w:tc>
       </w:tr>
       <w:tr>
+        <w:trPr>
+          <w:jc w:val="center"/>
+        </w:trPr>
         <w:tc>
           <w:tcPr>
             <w:cnfStyle w:val="001000000000" w:firstRow="0" w:lastRow="0" w:firstColumn="1" w:lastColumn="0" w:oddVBand="0" w:evenVBand="0" w:oddHBand="0" w:evenHBand="0" w:firstRowFirstColumn="0" w:firstRowLastColumn="0" w:lastRowFirstColumn="0" w:lastRowLastColumn="0"/>
-            <w:tcW w:w="4397" w:type="dxa"/>
-          </w:tcPr>
-          <w:p>
-            <w:pPr>
-              <w:jc w:val="center"/>
-            </w:pPr>
-          </w:p>
-        </w:tc>
-        <w:tc>
-          <w:tcPr>
-            <w:tcW w:w="4395" w:type="dxa"/>
+            <w:tcW w:w="0" w:type="auto"/>
+            <w:vAlign w:val="center"/>
+          </w:tcPr>
+          <w:p>
+            <w:pPr>
+              <w:jc w:val="center"/>
+            </w:pPr>
+            <w:r>
+              <w:t>21/06/2024</w:t>
+            </w:r>
+          </w:p>
+        </w:tc>
+        <w:tc>
+          <w:tcPr>
+            <w:tcW w:w="0" w:type="auto"/>
+            <w:vAlign w:val="center"/>
           </w:tcPr>
           <w:p>
             <w:pPr>
               <w:jc w:val="center"/>
               <w:cnfStyle w:val="000000000000" w:firstRow="0" w:lastRow="0" w:firstColumn="0" w:lastColumn="0" w:oddVBand="0" w:evenVBand="0" w:oddHBand="0" w:evenHBand="0" w:firstRowFirstColumn="0" w:firstRowLastColumn="0" w:lastRowFirstColumn="0" w:lastRowLastColumn="0"/>
             </w:pPr>
+            <w:r>
+              <w:t>Creación de la página de Iniciar Sesión</w:t>
+            </w:r>
+          </w:p>
+        </w:tc>
+        <w:tc>
+          <w:tcPr>
+            <w:tcW w:w="0" w:type="auto"/>
+            <w:vAlign w:val="center"/>
+          </w:tcPr>
+          <w:p>
+            <w:pPr>
+              <w:jc w:val="center"/>
+              <w:cnfStyle w:val="000000000000" w:firstRow="0" w:lastRow="0" w:firstColumn="0" w:lastColumn="0" w:oddVBand="0" w:evenVBand="0" w:oddHBand="0" w:evenHBand="0" w:firstRowFirstColumn="0" w:firstRowLastColumn="0" w:lastRowFirstColumn="0" w:lastRowLastColumn="0"/>
+            </w:pPr>
+            <w:proofErr w:type="spellStart"/>
+            <w:r>
+              <w:t>Frontend</w:t>
+            </w:r>
+            <w:proofErr w:type="spellEnd"/>
           </w:p>
         </w:tc>
       </w:tr>
       <w:tr>
         <w:trPr>
           <w:cnfStyle w:val="000000100000" w:firstRow="0" w:lastRow="0" w:firstColumn="0" w:lastColumn="0" w:oddVBand="0" w:evenVBand="0" w:oddHBand="1" w:evenHBand="0" w:firstRowFirstColumn="0" w:firstRowLastColumn="0" w:lastRowFirstColumn="0" w:lastRowLastColumn="0"/>
+          <w:jc w:val="center"/>
         </w:trPr>
         <w:tc>
           <w:tcPr>
             <w:cnfStyle w:val="001000000000" w:firstRow="0" w:lastRow="0" w:firstColumn="1" w:lastColumn="0" w:oddVBand="0" w:evenVBand="0" w:oddHBand="0" w:evenHBand="0" w:firstRowFirstColumn="0" w:firstRowLastColumn="0" w:lastRowFirstColumn="0" w:lastRowLastColumn="0"/>
-            <w:tcW w:w="4397" w:type="dxa"/>
-          </w:tcPr>
-          <w:p>
-            <w:pPr>
-              <w:jc w:val="center"/>
-            </w:pPr>
-          </w:p>
-        </w:tc>
-        <w:tc>
-          <w:tcPr>
-            <w:tcW w:w="4395" w:type="dxa"/>
+            <w:tcW w:w="0" w:type="auto"/>
+            <w:vAlign w:val="center"/>
+          </w:tcPr>
+          <w:p>
+            <w:pPr>
+              <w:jc w:val="center"/>
+            </w:pPr>
+            <w:r>
+              <w:t>2</w:t>
+            </w:r>
+            <w:r>
+              <w:t>2</w:t>
+            </w:r>
+            <w:r>
+              <w:t>/06/2024</w:t>
+            </w:r>
+          </w:p>
+        </w:tc>
+        <w:tc>
+          <w:tcPr>
+            <w:tcW w:w="0" w:type="auto"/>
+            <w:vAlign w:val="center"/>
           </w:tcPr>
           <w:p>
             <w:pPr>
               <w:jc w:val="center"/>
               <w:cnfStyle w:val="000000100000" w:firstRow="0" w:lastRow="0" w:firstColumn="0" w:lastColumn="0" w:oddVBand="0" w:evenVBand="0" w:oddHBand="1" w:evenHBand="0" w:firstRowFirstColumn="0" w:firstRowLastColumn="0" w:lastRowFirstColumn="0" w:lastRowLastColumn="0"/>
             </w:pPr>
+            <w:r>
+              <w:t>Arreglar el diseño de los campos de Iniciar Sesión</w:t>
+            </w:r>
+          </w:p>
+        </w:tc>
+        <w:tc>
+          <w:tcPr>
+            <w:tcW w:w="0" w:type="auto"/>
+            <w:vAlign w:val="center"/>
+          </w:tcPr>
+          <w:p>
+            <w:pPr>
+              <w:jc w:val="center"/>
+              <w:cnfStyle w:val="000000100000" w:firstRow="0" w:lastRow="0" w:firstColumn="0" w:lastColumn="0" w:oddVBand="0" w:evenVBand="0" w:oddHBand="1" w:evenHBand="0" w:firstRowFirstColumn="0" w:firstRowLastColumn="0" w:lastRowFirstColumn="0" w:lastRowLastColumn="0"/>
+            </w:pPr>
+            <w:proofErr w:type="spellStart"/>
+            <w:r>
+              <w:t>Frontend</w:t>
+            </w:r>
+            <w:proofErr w:type="spellEnd"/>
           </w:p>
         </w:tc>
       </w:tr>
       <w:tr>
+        <w:trPr>
+          <w:jc w:val="center"/>
+        </w:trPr>
         <w:tc>
           <w:tcPr>
             <w:cnfStyle w:val="001000000000" w:firstRow="0" w:lastRow="0" w:firstColumn="1" w:lastColumn="0" w:oddVBand="0" w:evenVBand="0" w:oddHBand="0" w:evenHBand="0" w:firstRowFirstColumn="0" w:firstRowLastColumn="0" w:lastRowFirstColumn="0" w:lastRowLastColumn="0"/>
-            <w:tcW w:w="4397" w:type="dxa"/>
-          </w:tcPr>
-          <w:p>
-            <w:pPr>
-              <w:jc w:val="center"/>
-            </w:pPr>
-          </w:p>
-        </w:tc>
-        <w:tc>
-          <w:tcPr>
-            <w:tcW w:w="4395" w:type="dxa"/>
+            <w:tcW w:w="0" w:type="auto"/>
+            <w:vAlign w:val="center"/>
+          </w:tcPr>
+          <w:p>
+            <w:pPr>
+              <w:jc w:val="center"/>
+            </w:pPr>
+            <w:r>
+              <w:t>2</w:t>
+            </w:r>
+            <w:r>
+              <w:t>2</w:t>
+            </w:r>
+            <w:r>
+              <w:t>/06/2024</w:t>
+            </w:r>
+          </w:p>
+        </w:tc>
+        <w:tc>
+          <w:tcPr>
+            <w:tcW w:w="0" w:type="auto"/>
+            <w:vAlign w:val="center"/>
           </w:tcPr>
           <w:p>
             <w:pPr>
               <w:jc w:val="center"/>
               <w:cnfStyle w:val="000000000000" w:firstRow="0" w:lastRow="0" w:firstColumn="0" w:lastColumn="0" w:oddVBand="0" w:evenVBand="0" w:oddHBand="0" w:evenHBand="0" w:firstRowFirstColumn="0" w:firstRowLastColumn="0" w:lastRowFirstColumn="0" w:lastRowLastColumn="0"/>
             </w:pPr>
+            <w:r>
+              <w:t>Creación de la página de Registrarse</w:t>
+            </w:r>
+          </w:p>
+        </w:tc>
+        <w:tc>
+          <w:tcPr>
+            <w:tcW w:w="0" w:type="auto"/>
+            <w:vAlign w:val="center"/>
+          </w:tcPr>
+          <w:p>
+            <w:pPr>
+              <w:jc w:val="center"/>
+              <w:cnfStyle w:val="000000000000" w:firstRow="0" w:lastRow="0" w:firstColumn="0" w:lastColumn="0" w:oddVBand="0" w:evenVBand="0" w:oddHBand="0" w:evenHBand="0" w:firstRowFirstColumn="0" w:firstRowLastColumn="0" w:lastRowFirstColumn="0" w:lastRowLastColumn="0"/>
+            </w:pPr>
+            <w:proofErr w:type="spellStart"/>
+            <w:r>
+              <w:t>Frontend</w:t>
+            </w:r>
+            <w:proofErr w:type="spellEnd"/>
           </w:p>
         </w:tc>
       </w:tr>
       <w:tr>
         <w:trPr>
           <w:cnfStyle w:val="000000100000" w:firstRow="0" w:lastRow="0" w:firstColumn="0" w:lastColumn="0" w:oddVBand="0" w:evenVBand="0" w:oddHBand="1" w:evenHBand="0" w:firstRowFirstColumn="0" w:firstRowLastColumn="0" w:lastRowFirstColumn="0" w:lastRowLastColumn="0"/>
+          <w:jc w:val="center"/>
         </w:trPr>
         <w:tc>
           <w:tcPr>
             <w:cnfStyle w:val="001000000000" w:firstRow="0" w:lastRow="0" w:firstColumn="1" w:lastColumn="0" w:oddVBand="0" w:evenVBand="0" w:oddHBand="0" w:evenHBand="0" w:firstRowFirstColumn="0" w:firstRowLastColumn="0" w:lastRowFirstColumn="0" w:lastRowLastColumn="0"/>
-            <w:tcW w:w="4397" w:type="dxa"/>
-          </w:tcPr>
-          <w:p>
-            <w:pPr>
-              <w:jc w:val="center"/>
-            </w:pPr>
-          </w:p>
-        </w:tc>
-        <w:tc>
-          <w:tcPr>
-            <w:tcW w:w="4395" w:type="dxa"/>
+            <w:tcW w:w="0" w:type="auto"/>
+            <w:vAlign w:val="center"/>
+          </w:tcPr>
+          <w:p>
+            <w:pPr>
+              <w:jc w:val="center"/>
+            </w:pPr>
+            <w:r>
+              <w:t>2</w:t>
+            </w:r>
+            <w:r>
+              <w:t>3</w:t>
+            </w:r>
+            <w:bookmarkStart w:id="0" w:name="_GoBack"/>
+            <w:bookmarkEnd w:id="0"/>
+            <w:r>
+              <w:t>/06/2024</w:t>
+            </w:r>
+          </w:p>
+        </w:tc>
+        <w:tc>
+          <w:tcPr>
+            <w:tcW w:w="0" w:type="auto"/>
+            <w:vAlign w:val="center"/>
           </w:tcPr>
           <w:p>
             <w:pPr>
               <w:jc w:val="center"/>
               <w:cnfStyle w:val="000000100000" w:firstRow="0" w:lastRow="0" w:firstColumn="0" w:lastColumn="0" w:oddVBand="0" w:evenVBand="0" w:oddHBand="1" w:evenHBand="0" w:firstRowFirstColumn="0" w:firstRowLastColumn="0" w:lastRowFirstColumn="0" w:lastRowLastColumn="0"/>
             </w:pPr>
+            <w:r>
+              <w:t>Incorporación de Archivos JS para crear nuevo usuario y administrador</w:t>
+            </w:r>
+          </w:p>
+        </w:tc>
+        <w:tc>
+          <w:tcPr>
+            <w:tcW w:w="0" w:type="auto"/>
+            <w:vAlign w:val="center"/>
+          </w:tcPr>
+          <w:p>
+            <w:pPr>
+              <w:jc w:val="center"/>
+              <w:cnfStyle w:val="000000100000" w:firstRow="0" w:lastRow="0" w:firstColumn="0" w:lastColumn="0" w:oddVBand="0" w:evenVBand="0" w:oddHBand="1" w:evenHBand="0" w:firstRowFirstColumn="0" w:firstRowLastColumn="0" w:lastRowFirstColumn="0" w:lastRowLastColumn="0"/>
+            </w:pPr>
+            <w:proofErr w:type="spellStart"/>
+            <w:r>
+              <w:t>Frontend</w:t>
+            </w:r>
+            <w:proofErr w:type="spellEnd"/>
           </w:p>
         </w:tc>
       </w:tr>
       <w:tr>
+        <w:trPr>
+          <w:jc w:val="center"/>
+        </w:trPr>
         <w:tc>
           <w:tcPr>
             <w:cnfStyle w:val="001000000000" w:firstRow="0" w:lastRow="0" w:firstColumn="1" w:lastColumn="0" w:oddVBand="0" w:evenVBand="0" w:oddHBand="0" w:evenHBand="0" w:firstRowFirstColumn="0" w:firstRowLastColumn="0" w:lastRowFirstColumn="0" w:lastRowLastColumn="0"/>
-            <w:tcW w:w="4397" w:type="dxa"/>
-          </w:tcPr>
-          <w:p>
-            <w:pPr>
-              <w:jc w:val="center"/>
-            </w:pPr>
-          </w:p>
-        </w:tc>
-        <w:tc>
-          <w:tcPr>
-            <w:tcW w:w="4395" w:type="dxa"/>
+            <w:tcW w:w="0" w:type="auto"/>
+            <w:vAlign w:val="center"/>
+          </w:tcPr>
+          <w:p>
+            <w:pPr>
+              <w:jc w:val="center"/>
+            </w:pPr>
+          </w:p>
+        </w:tc>
+        <w:tc>
+          <w:tcPr>
+            <w:tcW w:w="0" w:type="auto"/>
+            <w:vAlign w:val="center"/>
           </w:tcPr>
           <w:p>
             <w:pPr>
               <w:jc w:val="center"/>
               <w:cnfStyle w:val="000000000000" w:firstRow="0" w:lastRow="0" w:firstColumn="0" w:lastColumn="0" w:oddVBand="0" w:evenVBand="0" w:oddHBand="0" w:evenHBand="0" w:firstRowFirstColumn="0" w:firstRowLastColumn="0" w:lastRowFirstColumn="0" w:lastRowLastColumn="0"/>
+            </w:pPr>
+          </w:p>
+        </w:tc>
+        <w:tc>
+          <w:tcPr>
+            <w:tcW w:w="0" w:type="auto"/>
+            <w:vAlign w:val="center"/>
+          </w:tcPr>
+          <w:p>
+            <w:pPr>
+              <w:jc w:val="center"/>
+              <w:cnfStyle w:val="000000000000" w:firstRow="0" w:lastRow="0" w:firstColumn="0" w:lastColumn="0" w:oddVBand="0" w:evenVBand="0" w:oddHBand="0" w:evenHBand="0" w:firstRowFirstColumn="0" w:firstRowLastColumn="0" w:lastRowFirstColumn="0" w:lastRowLastColumn="0"/>
+            </w:pPr>
+          </w:p>
+        </w:tc>
+      </w:tr>
+      <w:tr>
+        <w:trPr>
+          <w:cnfStyle w:val="000000100000" w:firstRow="0" w:lastRow="0" w:firstColumn="0" w:lastColumn="0" w:oddVBand="0" w:evenVBand="0" w:oddHBand="1" w:evenHBand="0" w:firstRowFirstColumn="0" w:firstRowLastColumn="0" w:lastRowFirstColumn="0" w:lastRowLastColumn="0"/>
+          <w:jc w:val="center"/>
+        </w:trPr>
+        <w:tc>
+          <w:tcPr>
+            <w:cnfStyle w:val="001000000000" w:firstRow="0" w:lastRow="0" w:firstColumn="1" w:lastColumn="0" w:oddVBand="0" w:evenVBand="0" w:oddHBand="0" w:evenHBand="0" w:firstRowFirstColumn="0" w:firstRowLastColumn="0" w:lastRowFirstColumn="0" w:lastRowLastColumn="0"/>
+            <w:tcW w:w="0" w:type="auto"/>
+            <w:vAlign w:val="center"/>
+          </w:tcPr>
+          <w:p>
+            <w:pPr>
+              <w:jc w:val="center"/>
+            </w:pPr>
+          </w:p>
+        </w:tc>
+        <w:tc>
+          <w:tcPr>
+            <w:tcW w:w="0" w:type="auto"/>
+            <w:vAlign w:val="center"/>
+          </w:tcPr>
+          <w:p>
+            <w:pPr>
+              <w:jc w:val="center"/>
+              <w:cnfStyle w:val="000000100000" w:firstRow="0" w:lastRow="0" w:firstColumn="0" w:lastColumn="0" w:oddVBand="0" w:evenVBand="0" w:oddHBand="1" w:evenHBand="0" w:firstRowFirstColumn="0" w:firstRowLastColumn="0" w:lastRowFirstColumn="0" w:lastRowLastColumn="0"/>
+            </w:pPr>
+          </w:p>
+        </w:tc>
+        <w:tc>
+          <w:tcPr>
+            <w:tcW w:w="0" w:type="auto"/>
+            <w:vAlign w:val="center"/>
+          </w:tcPr>
+          <w:p>
+            <w:pPr>
+              <w:jc w:val="center"/>
+              <w:cnfStyle w:val="000000100000" w:firstRow="0" w:lastRow="0" w:firstColumn="0" w:lastColumn="0" w:oddVBand="0" w:evenVBand="0" w:oddHBand="1" w:evenHBand="0" w:firstRowFirstColumn="0" w:firstRowLastColumn="0" w:lastRowFirstColumn="0" w:lastRowLastColumn="0"/>
             </w:pPr>
           </w:p>
         </w:tc>
@@ -1311,7 +1536,7 @@
 </file>
 
 <file path=word/styles.xml><?xml version="1.0" encoding="utf-8"?>
-<w:styles xmlns:mc="http://schemas.openxmlformats.org/markup-compatibility/2006" xmlns:r="http://schemas.openxmlformats.org/officeDocument/2006/relationships" xmlns:w="http://schemas.openxmlformats.org/wordprocessingml/2006/main" xmlns:w14="http://schemas.microsoft.com/office/word/2010/wordml" xmlns:w15="http://schemas.microsoft.com/office/word/2012/wordml" xmlns:w16cex="http://schemas.microsoft.com/office/word/2018/wordml/cex" xmlns:w16cid="http://schemas.microsoft.com/office/word/2016/wordml/cid" xmlns:w16="http://schemas.microsoft.com/office/word/2018/wordml" xmlns:w16du="http://schemas.microsoft.com/office/word/2023/wordml/word16du" xmlns:w16sdtdh="http://schemas.microsoft.com/office/word/2020/wordml/sdtdatahash" xmlns:w16se="http://schemas.microsoft.com/office/word/2015/wordml/symex" mc:Ignorable="w14 w15 w16se w16cid w16 w16cex w16sdtdh w16du">
+<w:styles xmlns:mc="http://schemas.openxmlformats.org/markup-compatibility/2006" xmlns:r="http://schemas.openxmlformats.org/officeDocument/2006/relationships" xmlns:w="http://schemas.openxmlformats.org/wordprocessingml/2006/main" xmlns:w14="http://schemas.microsoft.com/office/word/2010/wordml" xmlns:w15="http://schemas.microsoft.com/office/word/2012/wordml" xmlns:w16se="http://schemas.microsoft.com/office/word/2015/wordml/symex" mc:Ignorable="w14 w15 w16se">
   <w:docDefaults>
     <w:rPrDefault>
       <w:rPr>
@@ -1329,7 +1554,7 @@
       </w:pPr>
     </w:pPrDefault>
   </w:docDefaults>
-  <w:latentStyles w:defLockedState="0" w:defUIPriority="99" w:defSemiHidden="0" w:defUnhideWhenUsed="0" w:defQFormat="0" w:count="376">
+  <w:latentStyles w:defLockedState="0" w:defUIPriority="99" w:defSemiHidden="0" w:defUnhideWhenUsed="0" w:defQFormat="0" w:count="371">
     <w:lsdException w:name="Normal" w:uiPriority="0" w:qFormat="1"/>
     <w:lsdException w:name="heading 1" w:uiPriority="9" w:qFormat="1"/>
     <w:lsdException w:name="heading 2" w:semiHidden="1" w:uiPriority="9" w:unhideWhenUsed="1" w:qFormat="1"/>
@@ -1701,11 +1926,6 @@
     <w:lsdException w:name="List Table 5 Dark Accent 6" w:uiPriority="50"/>
     <w:lsdException w:name="List Table 6 Colorful Accent 6" w:uiPriority="51"/>
     <w:lsdException w:name="List Table 7 Colorful Accent 6" w:uiPriority="52"/>
-    <w:lsdException w:name="Mention" w:semiHidden="1" w:unhideWhenUsed="1"/>
-    <w:lsdException w:name="Smart Hyperlink" w:semiHidden="1" w:unhideWhenUsed="1"/>
-    <w:lsdException w:name="Hashtag" w:semiHidden="1" w:unhideWhenUsed="1"/>
-    <w:lsdException w:name="Unresolved Mention" w:semiHidden="1" w:unhideWhenUsed="1"/>
-    <w:lsdException w:name="Smart Link" w:semiHidden="1" w:unhideWhenUsed="1"/>
   </w:latentStyles>
   <w:style w:type="paragraph" w:default="1" w:styleId="Normal">
     <w:name w:val="Normal"/>
@@ -2300,7 +2520,7 @@
       </w:tblBorders>
     </w:tblPr>
   </w:style>
-  <w:style w:type="table" w:styleId="Tablaconcuadrcula4-nfasis1">
+  <w:style w:type="table" w:styleId="Tabladecuadrcula4-nfasis1">
     <w:name w:val="Grid Table 4 Accent 1"/>
     <w:basedOn w:val="Tablanormal"/>
     <w:uiPriority w:val="49"/>
@@ -2376,7 +2596,7 @@
       </w:tcPr>
     </w:tblStylePr>
   </w:style>
-  <w:style w:type="table" w:styleId="Tablaconcuadrcula5oscura-nfasis1">
+  <w:style w:type="table" w:styleId="Tabladecuadrcula5oscura-nfasis1">
     <w:name w:val="Grid Table 5 Dark Accent 1"/>
     <w:basedOn w:val="Tablanormal"/>
     <w:uiPriority w:val="50"/>
@@ -2482,7 +2702,7 @@
       </w:tcPr>
     </w:tblStylePr>
   </w:style>
-  <w:style w:type="table" w:styleId="Tablaconcuadrcula4-nfasis4">
+  <w:style w:type="table" w:styleId="Tabladecuadrcula4-nfasis4">
     <w:name w:val="Grid Table 4 Accent 4"/>
     <w:basedOn w:val="Tablanormal"/>
     <w:uiPriority w:val="49"/>

</xml_diff>

<commit_message>
Funciona el registrar nuevos usuarios
</commit_message>
<xml_diff>
--- a/CRONOGRAMA.docx
+++ b/CRONOGRAMA.docx
@@ -1400,26 +1400,26 @@
             <w:r>
               <w:t>3</w:t>
             </w:r>
+            <w:r>
+              <w:t>/06/2024</w:t>
+            </w:r>
+          </w:p>
+        </w:tc>
+        <w:tc>
+          <w:tcPr>
+            <w:tcW w:w="0" w:type="auto"/>
+            <w:vAlign w:val="center"/>
+          </w:tcPr>
+          <w:p>
+            <w:pPr>
+              <w:jc w:val="center"/>
+              <w:cnfStyle w:val="000000100000" w:firstRow="0" w:lastRow="0" w:firstColumn="0" w:lastColumn="0" w:oddVBand="0" w:evenVBand="0" w:oddHBand="1" w:evenHBand="0" w:firstRowFirstColumn="0" w:firstRowLastColumn="0" w:lastRowFirstColumn="0" w:lastRowLastColumn="0"/>
+            </w:pPr>
+            <w:r>
+              <w:t>Creación de páginas para agregar, editar y eliminar para el Administrador</w:t>
+            </w:r>
             <w:bookmarkStart w:id="0" w:name="_GoBack"/>
             <w:bookmarkEnd w:id="0"/>
-            <w:r>
-              <w:t>/06/2024</w:t>
-            </w:r>
-          </w:p>
-        </w:tc>
-        <w:tc>
-          <w:tcPr>
-            <w:tcW w:w="0" w:type="auto"/>
-            <w:vAlign w:val="center"/>
-          </w:tcPr>
-          <w:p>
-            <w:pPr>
-              <w:jc w:val="center"/>
-              <w:cnfStyle w:val="000000100000" w:firstRow="0" w:lastRow="0" w:firstColumn="0" w:lastColumn="0" w:oddVBand="0" w:evenVBand="0" w:oddHBand="1" w:evenHBand="0" w:firstRowFirstColumn="0" w:firstRowLastColumn="0" w:lastRowFirstColumn="0" w:lastRowLastColumn="0"/>
-            </w:pPr>
-            <w:r>
-              <w:t>Incorporación de Archivos JS para crear nuevo usuario y administrador</w:t>
-            </w:r>
           </w:p>
         </w:tc>
         <w:tc>

</xml_diff>

<commit_message>
Se agregó la página de inicio del Administrador y sus respectivos cards para poder realizar sus funciones
</commit_message>
<xml_diff>
--- a/CRONOGRAMA.docx
+++ b/CRONOGRAMA.docx
@@ -85,7 +85,7 @@
               </wp:anchor>
             </w:drawing>
           </mc:Choice>
-          <mc:Fallback xmlns:w16sdtdh="http://schemas.microsoft.com/office/word/2020/wordml/sdtdatahash" xmlns:w16du="http://schemas.microsoft.com/office/word/2023/wordml/word16du" xmlns:w16="http://schemas.microsoft.com/office/word/2018/wordml" xmlns:w16cid="http://schemas.microsoft.com/office/word/2016/wordml/cid" xmlns:w16cex="http://schemas.microsoft.com/office/word/2018/wordml/cex" xmlns:oel="http://schemas.microsoft.com/office/2019/extlst" xmlns:am3d="http://schemas.microsoft.com/office/drawing/2017/model3d" xmlns:aink="http://schemas.microsoft.com/office/drawing/2016/ink" xmlns:cx8="http://schemas.microsoft.com/office/drawing/2016/5/14/chartex" xmlns:cx7="http://schemas.microsoft.com/office/drawing/2016/5/13/chartex" xmlns:cx6="http://schemas.microsoft.com/office/drawing/2016/5/12/chartex" xmlns:cx5="http://schemas.microsoft.com/office/drawing/2016/5/11/chartex" xmlns:cx4="http://schemas.microsoft.com/office/drawing/2016/5/10/chartex" xmlns:cx3="http://schemas.microsoft.com/office/drawing/2016/5/9/chartex" xmlns:cx2="http://schemas.microsoft.com/office/drawing/2015/10/21/chartex" xmlns:cx1="http://schemas.microsoft.com/office/drawing/2015/9/8/chartex">
+          <mc:Fallback xmlns:cx1="http://schemas.microsoft.com/office/drawing/2015/9/8/chartex" xmlns:cx2="http://schemas.microsoft.com/office/drawing/2015/10/21/chartex" xmlns:cx3="http://schemas.microsoft.com/office/drawing/2016/5/9/chartex" xmlns:cx4="http://schemas.microsoft.com/office/drawing/2016/5/10/chartex" xmlns:cx5="http://schemas.microsoft.com/office/drawing/2016/5/11/chartex" xmlns:cx6="http://schemas.microsoft.com/office/drawing/2016/5/12/chartex" xmlns:cx7="http://schemas.microsoft.com/office/drawing/2016/5/13/chartex" xmlns:cx8="http://schemas.microsoft.com/office/drawing/2016/5/14/chartex" xmlns:aink="http://schemas.microsoft.com/office/drawing/2016/ink" xmlns:am3d="http://schemas.microsoft.com/office/drawing/2017/model3d" xmlns:oel="http://schemas.microsoft.com/office/2019/extlst" xmlns:w16cex="http://schemas.microsoft.com/office/word/2018/wordml/cex" xmlns:w16cid="http://schemas.microsoft.com/office/word/2016/wordml/cid" xmlns:w16="http://schemas.microsoft.com/office/word/2018/wordml" xmlns:w16du="http://schemas.microsoft.com/office/word/2023/wordml/word16du" xmlns:w16sdtdh="http://schemas.microsoft.com/office/word/2020/wordml/sdtdatahash">
             <w:pict>
               <v:shapetype w14:anchorId="4D3B9F36" id="_x0000_t202" coordsize="21600,21600" o:spt="202" path="m,l,21600r21600,l21600,xe">
                 <v:stroke joinstyle="miter"/>
@@ -224,7 +224,7 @@
               </wp:anchor>
             </w:drawing>
           </mc:Choice>
-          <mc:Fallback xmlns:w16sdtdh="http://schemas.microsoft.com/office/word/2020/wordml/sdtdatahash" xmlns:w16du="http://schemas.microsoft.com/office/word/2023/wordml/word16du" xmlns:w16="http://schemas.microsoft.com/office/word/2018/wordml" xmlns:w16cid="http://schemas.microsoft.com/office/word/2016/wordml/cid" xmlns:w16cex="http://schemas.microsoft.com/office/word/2018/wordml/cex" xmlns:oel="http://schemas.microsoft.com/office/2019/extlst" xmlns:am3d="http://schemas.microsoft.com/office/drawing/2017/model3d" xmlns:aink="http://schemas.microsoft.com/office/drawing/2016/ink" xmlns:cx8="http://schemas.microsoft.com/office/drawing/2016/5/14/chartex" xmlns:cx7="http://schemas.microsoft.com/office/drawing/2016/5/13/chartex" xmlns:cx6="http://schemas.microsoft.com/office/drawing/2016/5/12/chartex" xmlns:cx5="http://schemas.microsoft.com/office/drawing/2016/5/11/chartex" xmlns:cx4="http://schemas.microsoft.com/office/drawing/2016/5/10/chartex" xmlns:cx3="http://schemas.microsoft.com/office/drawing/2016/5/9/chartex" xmlns:cx2="http://schemas.microsoft.com/office/drawing/2015/10/21/chartex" xmlns:cx1="http://schemas.microsoft.com/office/drawing/2015/9/8/chartex">
+          <mc:Fallback xmlns:cx1="http://schemas.microsoft.com/office/drawing/2015/9/8/chartex" xmlns:cx2="http://schemas.microsoft.com/office/drawing/2015/10/21/chartex" xmlns:cx3="http://schemas.microsoft.com/office/drawing/2016/5/9/chartex" xmlns:cx4="http://schemas.microsoft.com/office/drawing/2016/5/10/chartex" xmlns:cx5="http://schemas.microsoft.com/office/drawing/2016/5/11/chartex" xmlns:cx6="http://schemas.microsoft.com/office/drawing/2016/5/12/chartex" xmlns:cx7="http://schemas.microsoft.com/office/drawing/2016/5/13/chartex" xmlns:cx8="http://schemas.microsoft.com/office/drawing/2016/5/14/chartex" xmlns:aink="http://schemas.microsoft.com/office/drawing/2016/ink" xmlns:am3d="http://schemas.microsoft.com/office/drawing/2017/model3d" xmlns:oel="http://schemas.microsoft.com/office/2019/extlst" xmlns:w16cex="http://schemas.microsoft.com/office/word/2018/wordml/cex" xmlns:w16cid="http://schemas.microsoft.com/office/word/2016/wordml/cid" xmlns:w16="http://schemas.microsoft.com/office/word/2018/wordml" xmlns:w16du="http://schemas.microsoft.com/office/word/2023/wordml/word16du" xmlns:w16sdtdh="http://schemas.microsoft.com/office/word/2020/wordml/sdtdatahash">
             <w:pict>
               <v:rect w14:anchorId="11092EB7" id="Rectangle 17" o:spid="_x0000_s1027" style="position:absolute;margin-left:1.05pt;margin-top:75pt;width:412.95pt;height:97.75pt;z-index:251659264;visibility:visible;mso-wrap-style:square;mso-width-percent:0;mso-height-percent:0;mso-wrap-distance-left:0;mso-wrap-distance-top:0;mso-wrap-distance-right:0;mso-wrap-distance-bottom:0;mso-position-horizontal:absolute;mso-position-horizontal-relative:margin;mso-position-vertical:absolute;mso-position-vertical-relative:page;mso-width-percent:0;mso-height-percent:0;mso-width-relative:margin;mso-height-relative:margin;v-text-anchor:top" o:gfxdata="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" filled="f" stroked="f">
                 <v:shadow on="t" color="#143c3c" origin=",.5" offset="1.01mm,1.01mm"/>
@@ -346,7 +346,7 @@
               </wp:anchor>
             </w:drawing>
           </mc:Choice>
-          <mc:Fallback xmlns:w16sdtdh="http://schemas.microsoft.com/office/word/2020/wordml/sdtdatahash" xmlns:w16du="http://schemas.microsoft.com/office/word/2023/wordml/word16du" xmlns:w16="http://schemas.microsoft.com/office/word/2018/wordml" xmlns:w16cid="http://schemas.microsoft.com/office/word/2016/wordml/cid" xmlns:w16cex="http://schemas.microsoft.com/office/word/2018/wordml/cex" xmlns:oel="http://schemas.microsoft.com/office/2019/extlst" xmlns:am3d="http://schemas.microsoft.com/office/drawing/2017/model3d" xmlns:aink="http://schemas.microsoft.com/office/drawing/2016/ink" xmlns:cx8="http://schemas.microsoft.com/office/drawing/2016/5/14/chartex" xmlns:cx7="http://schemas.microsoft.com/office/drawing/2016/5/13/chartex" xmlns:cx6="http://schemas.microsoft.com/office/drawing/2016/5/12/chartex" xmlns:cx5="http://schemas.microsoft.com/office/drawing/2016/5/11/chartex" xmlns:cx4="http://schemas.microsoft.com/office/drawing/2016/5/10/chartex" xmlns:cx3="http://schemas.microsoft.com/office/drawing/2016/5/9/chartex" xmlns:cx2="http://schemas.microsoft.com/office/drawing/2015/10/21/chartex" xmlns:cx1="http://schemas.microsoft.com/office/drawing/2015/9/8/chartex">
+          <mc:Fallback xmlns:cx1="http://schemas.microsoft.com/office/drawing/2015/9/8/chartex" xmlns:cx2="http://schemas.microsoft.com/office/drawing/2015/10/21/chartex" xmlns:cx3="http://schemas.microsoft.com/office/drawing/2016/5/9/chartex" xmlns:cx4="http://schemas.microsoft.com/office/drawing/2016/5/10/chartex" xmlns:cx5="http://schemas.microsoft.com/office/drawing/2016/5/11/chartex" xmlns:cx6="http://schemas.microsoft.com/office/drawing/2016/5/12/chartex" xmlns:cx7="http://schemas.microsoft.com/office/drawing/2016/5/13/chartex" xmlns:cx8="http://schemas.microsoft.com/office/drawing/2016/5/14/chartex" xmlns:aink="http://schemas.microsoft.com/office/drawing/2016/ink" xmlns:am3d="http://schemas.microsoft.com/office/drawing/2017/model3d" xmlns:oel="http://schemas.microsoft.com/office/2019/extlst" xmlns:w16cex="http://schemas.microsoft.com/office/word/2018/wordml/cex" xmlns:w16cid="http://schemas.microsoft.com/office/word/2016/wordml/cid" xmlns:w16="http://schemas.microsoft.com/office/word/2018/wordml" xmlns:w16du="http://schemas.microsoft.com/office/word/2023/wordml/word16du" xmlns:w16sdtdh="http://schemas.microsoft.com/office/word/2020/wordml/sdtdatahash">
             <w:pict>
               <v:rect w14:anchorId="739947F8" id="Rectangle 4" o:spid="_x0000_s1026" style="position:absolute;margin-left:-62.45pt;margin-top:-62.65pt;width:687.75pt;height:845.6pt;z-index:-251650048;visibility:visible;mso-wrap-style:square;mso-height-percent:0;mso-wrap-distance-left:9pt;mso-wrap-distance-top:0;mso-wrap-distance-right:9pt;mso-wrap-distance-bottom:0;mso-position-horizontal:absolute;mso-position-horizontal-relative:margin;mso-position-vertical:absolute;mso-position-vertical-relative:text;mso-height-percent:0;mso-height-relative:margin;v-text-anchor:middle" o:gfxdata="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" fillcolor="#f2f2f2 [3052]" stroked="f" strokeweight="1pt">
                 <w10:wrap anchorx="margin"/>
@@ -452,7 +452,7 @@
               </wp:anchor>
             </w:drawing>
           </mc:Choice>
-          <mc:Fallback xmlns:w16sdtdh="http://schemas.microsoft.com/office/word/2020/wordml/sdtdatahash" xmlns:w16du="http://schemas.microsoft.com/office/word/2023/wordml/word16du" xmlns:w16="http://schemas.microsoft.com/office/word/2018/wordml" xmlns:w16cid="http://schemas.microsoft.com/office/word/2016/wordml/cid" xmlns:w16cex="http://schemas.microsoft.com/office/word/2018/wordml/cex" xmlns:oel="http://schemas.microsoft.com/office/2019/extlst" xmlns:am3d="http://schemas.microsoft.com/office/drawing/2017/model3d" xmlns:aink="http://schemas.microsoft.com/office/drawing/2016/ink" xmlns:cx8="http://schemas.microsoft.com/office/drawing/2016/5/14/chartex" xmlns:cx7="http://schemas.microsoft.com/office/drawing/2016/5/13/chartex" xmlns:cx6="http://schemas.microsoft.com/office/drawing/2016/5/12/chartex" xmlns:cx5="http://schemas.microsoft.com/office/drawing/2016/5/11/chartex" xmlns:cx4="http://schemas.microsoft.com/office/drawing/2016/5/10/chartex" xmlns:cx3="http://schemas.microsoft.com/office/drawing/2016/5/9/chartex" xmlns:cx2="http://schemas.microsoft.com/office/drawing/2015/10/21/chartex" xmlns:cx1="http://schemas.microsoft.com/office/drawing/2015/9/8/chartex">
+          <mc:Fallback xmlns:cx1="http://schemas.microsoft.com/office/drawing/2015/9/8/chartex" xmlns:cx2="http://schemas.microsoft.com/office/drawing/2015/10/21/chartex" xmlns:cx3="http://schemas.microsoft.com/office/drawing/2016/5/9/chartex" xmlns:cx4="http://schemas.microsoft.com/office/drawing/2016/5/10/chartex" xmlns:cx5="http://schemas.microsoft.com/office/drawing/2016/5/11/chartex" xmlns:cx6="http://schemas.microsoft.com/office/drawing/2016/5/12/chartex" xmlns:cx7="http://schemas.microsoft.com/office/drawing/2016/5/13/chartex" xmlns:cx8="http://schemas.microsoft.com/office/drawing/2016/5/14/chartex" xmlns:aink="http://schemas.microsoft.com/office/drawing/2016/ink" xmlns:am3d="http://schemas.microsoft.com/office/drawing/2017/model3d" xmlns:oel="http://schemas.microsoft.com/office/2019/extlst" xmlns:w16cex="http://schemas.microsoft.com/office/word/2018/wordml/cex" xmlns:w16cid="http://schemas.microsoft.com/office/word/2016/wordml/cid" xmlns:w16="http://schemas.microsoft.com/office/word/2018/wordml" xmlns:w16du="http://schemas.microsoft.com/office/word/2023/wordml/word16du" xmlns:w16sdtdh="http://schemas.microsoft.com/office/word/2020/wordml/sdtdatahash">
             <w:pict>
               <v:shape w14:anchorId="6503FE1F" id="_x0000_s1028" type="#_x0000_t202" style="position:absolute;margin-left:1.35pt;margin-top:223.55pt;width:456.7pt;height:81.65pt;z-index:251663360;visibility:visible;mso-wrap-style:square;mso-width-percent:0;mso-height-percent:0;mso-wrap-distance-left:9pt;mso-wrap-distance-top:0;mso-wrap-distance-right:9pt;mso-wrap-distance-bottom:0;mso-position-horizontal:absolute;mso-position-horizontal-relative:text;mso-position-vertical:absolute;mso-position-vertical-relative:page;mso-width-percent:0;mso-height-percent:0;mso-width-relative:margin;mso-height-relative:margin;v-text-anchor:top" o:gfxdata="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" filled="f" stroked="f" strokeweight=".5pt">
                 <v:textbox>
@@ -575,7 +575,7 @@
               </wp:anchor>
             </w:drawing>
           </mc:Choice>
-          <mc:Fallback xmlns:w16sdtdh="http://schemas.microsoft.com/office/word/2020/wordml/sdtdatahash" xmlns:w16du="http://schemas.microsoft.com/office/word/2023/wordml/word16du" xmlns:w16="http://schemas.microsoft.com/office/word/2018/wordml" xmlns:w16cid="http://schemas.microsoft.com/office/word/2016/wordml/cid" xmlns:w16cex="http://schemas.microsoft.com/office/word/2018/wordml/cex" xmlns:oel="http://schemas.microsoft.com/office/2019/extlst" xmlns:am3d="http://schemas.microsoft.com/office/drawing/2017/model3d" xmlns:aink="http://schemas.microsoft.com/office/drawing/2016/ink" xmlns:cx8="http://schemas.microsoft.com/office/drawing/2016/5/14/chartex" xmlns:cx7="http://schemas.microsoft.com/office/drawing/2016/5/13/chartex" xmlns:cx6="http://schemas.microsoft.com/office/drawing/2016/5/12/chartex" xmlns:cx5="http://schemas.microsoft.com/office/drawing/2016/5/11/chartex" xmlns:cx4="http://schemas.microsoft.com/office/drawing/2016/5/10/chartex" xmlns:cx3="http://schemas.microsoft.com/office/drawing/2016/5/9/chartex" xmlns:cx2="http://schemas.microsoft.com/office/drawing/2015/10/21/chartex" xmlns:cx1="http://schemas.microsoft.com/office/drawing/2015/9/8/chartex">
+          <mc:Fallback xmlns:cx1="http://schemas.microsoft.com/office/drawing/2015/9/8/chartex" xmlns:cx2="http://schemas.microsoft.com/office/drawing/2015/10/21/chartex" xmlns:cx3="http://schemas.microsoft.com/office/drawing/2016/5/9/chartex" xmlns:cx4="http://schemas.microsoft.com/office/drawing/2016/5/10/chartex" xmlns:cx5="http://schemas.microsoft.com/office/drawing/2016/5/11/chartex" xmlns:cx6="http://schemas.microsoft.com/office/drawing/2016/5/12/chartex" xmlns:cx7="http://schemas.microsoft.com/office/drawing/2016/5/13/chartex" xmlns:cx8="http://schemas.microsoft.com/office/drawing/2016/5/14/chartex" xmlns:aink="http://schemas.microsoft.com/office/drawing/2016/ink" xmlns:am3d="http://schemas.microsoft.com/office/drawing/2017/model3d" xmlns:oel="http://schemas.microsoft.com/office/2019/extlst" xmlns:w16cex="http://schemas.microsoft.com/office/word/2018/wordml/cex" xmlns:w16cid="http://schemas.microsoft.com/office/word/2016/wordml/cid" xmlns:w16="http://schemas.microsoft.com/office/word/2018/wordml" xmlns:w16du="http://schemas.microsoft.com/office/word/2023/wordml/word16du" xmlns:w16sdtdh="http://schemas.microsoft.com/office/word/2020/wordml/sdtdatahash">
             <w:pict>
               <v:rect w14:anchorId="7A63B8B3" id="Rectangle 5" o:spid="_x0000_s1026" style="position:absolute;margin-left:1.05pt;margin-top:353.4pt;width:348.15pt;height:5.35pt;z-index:251664384;visibility:visible;mso-wrap-style:square;mso-wrap-distance-left:9pt;mso-wrap-distance-top:0;mso-wrap-distance-right:9pt;mso-wrap-distance-bottom:0;mso-position-horizontal:absolute;mso-position-horizontal-relative:text;mso-position-vertical:absolute;mso-position-vertical-relative:page;v-text-anchor:middle" o:gfxdata="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" fillcolor="#f9a826" stroked="f" strokeweight="1pt">
                 <w10:wrap type="topAndBottom" anchory="page"/>
@@ -619,7 +619,7 @@
                           <a14:useLocalDpi xmlns:a14="http://schemas.microsoft.com/office/drawing/2010/main" val="0"/>
                         </a:ext>
                         <a:ext uri="{96DAC541-7B7A-43D3-8B79-37D633B846F1}">
-                          <asvg:svgBlip xmlns:asvg="http://schemas.microsoft.com/office/drawing/2016/SVG/main" xmlns:w16sdtdh="http://schemas.microsoft.com/office/word/2020/wordml/sdtdatahash" xmlns:w16du="http://schemas.microsoft.com/office/word/2023/wordml/word16du" xmlns:w16="http://schemas.microsoft.com/office/word/2018/wordml" xmlns:w16cid="http://schemas.microsoft.com/office/word/2016/wordml/cid" xmlns:w16cex="http://schemas.microsoft.com/office/word/2018/wordml/cex" xmlns:w="http://schemas.openxmlformats.org/wordprocessingml/2006/main" xmlns:w10="urn:schemas-microsoft-com:office:word" xmlns:v="urn:schemas-microsoft-com:vml" xmlns:oel="http://schemas.microsoft.com/office/2019/extlst" xmlns:o="urn:schemas-microsoft-com:office:office" xmlns:am3d="http://schemas.microsoft.com/office/drawing/2017/model3d" xmlns:aink="http://schemas.microsoft.com/office/drawing/2016/ink" xmlns:cx8="http://schemas.microsoft.com/office/drawing/2016/5/14/chartex" xmlns:cx7="http://schemas.microsoft.com/office/drawing/2016/5/13/chartex" xmlns:cx6="http://schemas.microsoft.com/office/drawing/2016/5/12/chartex" xmlns:cx5="http://schemas.microsoft.com/office/drawing/2016/5/11/chartex" xmlns:cx4="http://schemas.microsoft.com/office/drawing/2016/5/10/chartex" xmlns:cx3="http://schemas.microsoft.com/office/drawing/2016/5/9/chartex" xmlns:cx2="http://schemas.microsoft.com/office/drawing/2015/10/21/chartex" xmlns:cx1="http://schemas.microsoft.com/office/drawing/2015/9/8/chartex" xmlns="" r:embed="rId5"/>
+                          <asvg:svgBlip xmlns="" xmlns:cx1="http://schemas.microsoft.com/office/drawing/2015/9/8/chartex" xmlns:cx2="http://schemas.microsoft.com/office/drawing/2015/10/21/chartex" xmlns:cx3="http://schemas.microsoft.com/office/drawing/2016/5/9/chartex" xmlns:cx4="http://schemas.microsoft.com/office/drawing/2016/5/10/chartex" xmlns:cx5="http://schemas.microsoft.com/office/drawing/2016/5/11/chartex" xmlns:cx6="http://schemas.microsoft.com/office/drawing/2016/5/12/chartex" xmlns:cx7="http://schemas.microsoft.com/office/drawing/2016/5/13/chartex" xmlns:cx8="http://schemas.microsoft.com/office/drawing/2016/5/14/chartex" xmlns:aink="http://schemas.microsoft.com/office/drawing/2016/ink" xmlns:am3d="http://schemas.microsoft.com/office/drawing/2017/model3d" xmlns:o="urn:schemas-microsoft-com:office:office" xmlns:oel="http://schemas.microsoft.com/office/2019/extlst" xmlns:v="urn:schemas-microsoft-com:vml" xmlns:w10="urn:schemas-microsoft-com:office:word" xmlns:w="http://schemas.openxmlformats.org/wordprocessingml/2006/main" xmlns:w16cex="http://schemas.microsoft.com/office/word/2018/wordml/cex" xmlns:w16cid="http://schemas.microsoft.com/office/word/2016/wordml/cid" xmlns:w16="http://schemas.microsoft.com/office/word/2018/wordml" xmlns:w16du="http://schemas.microsoft.com/office/word/2023/wordml/word16du" xmlns:w16sdtdh="http://schemas.microsoft.com/office/word/2020/wordml/sdtdatahash" xmlns:asvg="http://schemas.microsoft.com/office/drawing/2016/SVG/main" r:embed="rId5"/>
                         </a:ext>
                       </a:extLst>
                     </a:blip>
@@ -1278,13 +1278,7 @@
               <w:jc w:val="center"/>
             </w:pPr>
             <w:r>
-              <w:t>2</w:t>
-            </w:r>
-            <w:r>
-              <w:t>2</w:t>
-            </w:r>
-            <w:r>
-              <w:t>/06/2024</w:t>
+              <w:t>22/06/2024</w:t>
             </w:r>
           </w:p>
         </w:tc>
@@ -1336,13 +1330,7 @@
               <w:jc w:val="center"/>
             </w:pPr>
             <w:r>
-              <w:t>2</w:t>
-            </w:r>
-            <w:r>
-              <w:t>2</w:t>
-            </w:r>
-            <w:r>
-              <w:t>/06/2024</w:t>
+              <w:t>22/06/2024</w:t>
             </w:r>
           </w:p>
         </w:tc>
@@ -1395,13 +1383,7 @@
               <w:jc w:val="center"/>
             </w:pPr>
             <w:r>
-              <w:t>2</w:t>
-            </w:r>
-            <w:r>
-              <w:t>3</w:t>
-            </w:r>
-            <w:r>
-              <w:t>/06/2024</w:t>
+              <w:t>23/06/2024</w:t>
             </w:r>
           </w:p>
         </w:tc>
@@ -1418,8 +1400,6 @@
             <w:r>
               <w:t>Creación de páginas para agregar, editar y eliminar para el Administrador</w:t>
             </w:r>
-            <w:bookmarkStart w:id="0" w:name="_GoBack"/>
-            <w:bookmarkEnd w:id="0"/>
           </w:p>
         </w:tc>
         <w:tc>
@@ -1454,6 +1434,9 @@
             <w:pPr>
               <w:jc w:val="center"/>
             </w:pPr>
+            <w:r>
+              <w:t>23/06/2024</w:t>
+            </w:r>
           </w:p>
         </w:tc>
         <w:tc>
@@ -1466,6 +1449,9 @@
               <w:jc w:val="center"/>
               <w:cnfStyle w:val="000000000000" w:firstRow="0" w:lastRow="0" w:firstColumn="0" w:lastColumn="0" w:oddVBand="0" w:evenVBand="0" w:oddHBand="0" w:evenHBand="0" w:firstRowFirstColumn="0" w:firstRowLastColumn="0" w:lastRowFirstColumn="0" w:lastRowLastColumn="0"/>
             </w:pPr>
+            <w:r>
+              <w:t>Hacer funcionar el Registrar nuevos usuarios</w:t>
+            </w:r>
           </w:p>
         </w:tc>
         <w:tc>
@@ -1478,6 +1464,11 @@
               <w:jc w:val="center"/>
               <w:cnfStyle w:val="000000000000" w:firstRow="0" w:lastRow="0" w:firstColumn="0" w:lastColumn="0" w:oddVBand="0" w:evenVBand="0" w:oddHBand="0" w:evenHBand="0" w:firstRowFirstColumn="0" w:firstRowLastColumn="0" w:lastRowFirstColumn="0" w:lastRowLastColumn="0"/>
             </w:pPr>
+            <w:proofErr w:type="spellStart"/>
+            <w:r>
+              <w:t>Frontend</w:t>
+            </w:r>
+            <w:proofErr w:type="spellEnd"/>
           </w:p>
         </w:tc>
       </w:tr>
@@ -1496,6 +1487,9 @@
             <w:pPr>
               <w:jc w:val="center"/>
             </w:pPr>
+            <w:r>
+              <w:t>23/06/2024</w:t>
+            </w:r>
           </w:p>
         </w:tc>
         <w:tc>
@@ -1508,6 +1502,17 @@
               <w:jc w:val="center"/>
               <w:cnfStyle w:val="000000100000" w:firstRow="0" w:lastRow="0" w:firstColumn="0" w:lastColumn="0" w:oddVBand="0" w:evenVBand="0" w:oddHBand="1" w:evenHBand="0" w:firstRowFirstColumn="0" w:firstRowLastColumn="0" w:lastRowFirstColumn="0" w:lastRowLastColumn="0"/>
             </w:pPr>
+            <w:r>
+              <w:t xml:space="preserve">Creación de página de inicio del Administrador y también de los </w:t>
+            </w:r>
+            <w:proofErr w:type="spellStart"/>
+            <w:r>
+              <w:t>cards</w:t>
+            </w:r>
+            <w:proofErr w:type="spellEnd"/>
+            <w:r>
+              <w:t xml:space="preserve"> para llevarlo a las páginas donde realiza sus funciones</w:t>
+            </w:r>
           </w:p>
         </w:tc>
         <w:tc>
@@ -1520,6 +1525,11 @@
               <w:jc w:val="center"/>
               <w:cnfStyle w:val="000000100000" w:firstRow="0" w:lastRow="0" w:firstColumn="0" w:lastColumn="0" w:oddVBand="0" w:evenVBand="0" w:oddHBand="1" w:evenHBand="0" w:firstRowFirstColumn="0" w:firstRowLastColumn="0" w:lastRowFirstColumn="0" w:lastRowLastColumn="0"/>
             </w:pPr>
+            <w:r>
+              <w:t>Frontend</w:t>
+            </w:r>
+            <w:bookmarkStart w:id="0" w:name="_GoBack"/>
+            <w:bookmarkEnd w:id="0"/>
           </w:p>
         </w:tc>
       </w:tr>

</xml_diff>

<commit_message>
Implementaciones de Backend y Front end
Rol de administrador
</commit_message>
<xml_diff>
--- a/CRONOGRAMA.docx
+++ b/CRONOGRAMA.docx
@@ -1241,13 +1241,7 @@
               <w:cnfStyle w:val="000000000000" w:firstRow="0" w:lastRow="0" w:firstColumn="0" w:lastColumn="0" w:oddVBand="0" w:evenVBand="0" w:oddHBand="0" w:evenHBand="0" w:firstRowFirstColumn="0" w:firstRowLastColumn="0" w:lastRowFirstColumn="0" w:lastRowLastColumn="0"/>
             </w:pPr>
             <w:r>
-              <w:t xml:space="preserve">Implementación de </w:t>
-            </w:r>
-            <w:r>
-              <w:t>Editar</w:t>
-            </w:r>
-            <w:r>
-              <w:t xml:space="preserve"> Usuario Especifico</w:t>
+              <w:t>Implementación de Editar Usuario Especifico</w:t>
             </w:r>
           </w:p>
         </w:tc>
@@ -1769,6 +1763,556 @@
             </w:pPr>
             <w:r>
               <w:t xml:space="preserve">Documentación </w:t>
+            </w:r>
+          </w:p>
+        </w:tc>
+      </w:tr>
+      <w:tr>
+        <w:trPr>
+          <w:cnfStyle w:val="000000100000" w:firstRow="0" w:lastRow="0" w:firstColumn="0" w:lastColumn="0" w:oddVBand="0" w:evenVBand="0" w:oddHBand="1" w:evenHBand="0" w:firstRowFirstColumn="0" w:firstRowLastColumn="0" w:lastRowFirstColumn="0" w:lastRowLastColumn="0"/>
+          <w:jc w:val="center"/>
+        </w:trPr>
+        <w:tc>
+          <w:tcPr>
+            <w:cnfStyle w:val="001000000000" w:firstRow="0" w:lastRow="0" w:firstColumn="1" w:lastColumn="0" w:oddVBand="0" w:evenVBand="0" w:oddHBand="0" w:evenHBand="0" w:firstRowFirstColumn="0" w:firstRowLastColumn="0" w:lastRowFirstColumn="0" w:lastRowLastColumn="0"/>
+            <w:tcW w:w="0" w:type="auto"/>
+          </w:tcPr>
+          <w:p>
+            <w:pPr>
+              <w:jc w:val="center"/>
+            </w:pPr>
+            <w:r>
+              <w:t>25/06/2024</w:t>
+            </w:r>
+          </w:p>
+        </w:tc>
+        <w:tc>
+          <w:tcPr>
+            <w:tcW w:w="0" w:type="auto"/>
+            <w:vAlign w:val="center"/>
+          </w:tcPr>
+          <w:p>
+            <w:pPr>
+              <w:jc w:val="center"/>
+              <w:cnfStyle w:val="000000100000" w:firstRow="0" w:lastRow="0" w:firstColumn="0" w:lastColumn="0" w:oddVBand="0" w:evenVBand="0" w:oddHBand="1" w:evenHBand="0" w:firstRowFirstColumn="0" w:firstRowLastColumn="0" w:lastRowFirstColumn="0" w:lastRowLastColumn="0"/>
+            </w:pPr>
+            <w:r>
+              <w:t xml:space="preserve">Implementación de comentarios </w:t>
+            </w:r>
+          </w:p>
+        </w:tc>
+        <w:tc>
+          <w:tcPr>
+            <w:tcW w:w="0" w:type="auto"/>
+            <w:vAlign w:val="center"/>
+          </w:tcPr>
+          <w:p>
+            <w:pPr>
+              <w:jc w:val="center"/>
+              <w:cnfStyle w:val="000000100000" w:firstRow="0" w:lastRow="0" w:firstColumn="0" w:lastColumn="0" w:oddVBand="0" w:evenVBand="0" w:oddHBand="1" w:evenHBand="0" w:firstRowFirstColumn="0" w:firstRowLastColumn="0" w:lastRowFirstColumn="0" w:lastRowLastColumn="0"/>
+            </w:pPr>
+            <w:r>
+              <w:t>Backend</w:t>
+            </w:r>
+          </w:p>
+        </w:tc>
+      </w:tr>
+      <w:tr>
+        <w:trPr>
+          <w:jc w:val="center"/>
+        </w:trPr>
+        <w:tc>
+          <w:tcPr>
+            <w:cnfStyle w:val="001000000000" w:firstRow="0" w:lastRow="0" w:firstColumn="1" w:lastColumn="0" w:oddVBand="0" w:evenVBand="0" w:oddHBand="0" w:evenHBand="0" w:firstRowFirstColumn="0" w:firstRowLastColumn="0" w:lastRowFirstColumn="0" w:lastRowLastColumn="0"/>
+            <w:tcW w:w="0" w:type="auto"/>
+          </w:tcPr>
+          <w:p>
+            <w:pPr>
+              <w:jc w:val="center"/>
+            </w:pPr>
+            <w:r>
+              <w:t>25/06/2024</w:t>
+            </w:r>
+          </w:p>
+        </w:tc>
+        <w:tc>
+          <w:tcPr>
+            <w:tcW w:w="0" w:type="auto"/>
+            <w:vAlign w:val="center"/>
+          </w:tcPr>
+          <w:p>
+            <w:pPr>
+              <w:jc w:val="center"/>
+              <w:cnfStyle w:val="000000000000" w:firstRow="0" w:lastRow="0" w:firstColumn="0" w:lastColumn="0" w:oddVBand="0" w:evenVBand="0" w:oddHBand="0" w:evenHBand="0" w:firstRowFirstColumn="0" w:firstRowLastColumn="0" w:lastRowFirstColumn="0" w:lastRowLastColumn="0"/>
+            </w:pPr>
+            <w:r>
+              <w:t>Implementación de alquilar Pelicula</w:t>
+            </w:r>
+          </w:p>
+        </w:tc>
+        <w:tc>
+          <w:tcPr>
+            <w:tcW w:w="0" w:type="auto"/>
+            <w:vAlign w:val="center"/>
+          </w:tcPr>
+          <w:p>
+            <w:pPr>
+              <w:jc w:val="center"/>
+              <w:cnfStyle w:val="000000000000" w:firstRow="0" w:lastRow="0" w:firstColumn="0" w:lastColumn="0" w:oddVBand="0" w:evenVBand="0" w:oddHBand="0" w:evenHBand="0" w:firstRowFirstColumn="0" w:firstRowLastColumn="0" w:lastRowFirstColumn="0" w:lastRowLastColumn="0"/>
+            </w:pPr>
+            <w:r>
+              <w:t>Backend</w:t>
+            </w:r>
+          </w:p>
+        </w:tc>
+      </w:tr>
+      <w:tr>
+        <w:trPr>
+          <w:cnfStyle w:val="000000100000" w:firstRow="0" w:lastRow="0" w:firstColumn="0" w:lastColumn="0" w:oddVBand="0" w:evenVBand="0" w:oddHBand="1" w:evenHBand="0" w:firstRowFirstColumn="0" w:firstRowLastColumn="0" w:lastRowFirstColumn="0" w:lastRowLastColumn="0"/>
+          <w:jc w:val="center"/>
+        </w:trPr>
+        <w:tc>
+          <w:tcPr>
+            <w:cnfStyle w:val="001000000000" w:firstRow="0" w:lastRow="0" w:firstColumn="1" w:lastColumn="0" w:oddVBand="0" w:evenVBand="0" w:oddHBand="0" w:evenHBand="0" w:firstRowFirstColumn="0" w:firstRowLastColumn="0" w:lastRowFirstColumn="0" w:lastRowLastColumn="0"/>
+            <w:tcW w:w="0" w:type="auto"/>
+          </w:tcPr>
+          <w:p>
+            <w:pPr>
+              <w:jc w:val="center"/>
+            </w:pPr>
+            <w:r>
+              <w:t>25/06/2024</w:t>
+            </w:r>
+          </w:p>
+        </w:tc>
+        <w:tc>
+          <w:tcPr>
+            <w:tcW w:w="0" w:type="auto"/>
+            <w:vAlign w:val="center"/>
+          </w:tcPr>
+          <w:p>
+            <w:pPr>
+              <w:jc w:val="center"/>
+              <w:cnfStyle w:val="000000100000" w:firstRow="0" w:lastRow="0" w:firstColumn="0" w:lastColumn="0" w:oddVBand="0" w:evenVBand="0" w:oddHBand="1" w:evenHBand="0" w:firstRowFirstColumn="0" w:firstRowLastColumn="0" w:lastRowFirstColumn="0" w:lastRowLastColumn="0"/>
+            </w:pPr>
+            <w:r>
+              <w:t>Implementación Devolver pelicula</w:t>
+            </w:r>
+          </w:p>
+        </w:tc>
+        <w:tc>
+          <w:tcPr>
+            <w:tcW w:w="0" w:type="auto"/>
+            <w:vAlign w:val="center"/>
+          </w:tcPr>
+          <w:p>
+            <w:pPr>
+              <w:jc w:val="center"/>
+              <w:cnfStyle w:val="000000100000" w:firstRow="0" w:lastRow="0" w:firstColumn="0" w:lastColumn="0" w:oddVBand="0" w:evenVBand="0" w:oddHBand="1" w:evenHBand="0" w:firstRowFirstColumn="0" w:firstRowLastColumn="0" w:lastRowFirstColumn="0" w:lastRowLastColumn="0"/>
+            </w:pPr>
+            <w:r>
+              <w:t>Backend</w:t>
+            </w:r>
+          </w:p>
+        </w:tc>
+      </w:tr>
+      <w:tr>
+        <w:trPr>
+          <w:jc w:val="center"/>
+        </w:trPr>
+        <w:tc>
+          <w:tcPr>
+            <w:cnfStyle w:val="001000000000" w:firstRow="0" w:lastRow="0" w:firstColumn="1" w:lastColumn="0" w:oddVBand="0" w:evenVBand="0" w:oddHBand="0" w:evenHBand="0" w:firstRowFirstColumn="0" w:firstRowLastColumn="0" w:lastRowFirstColumn="0" w:lastRowLastColumn="0"/>
+            <w:tcW w:w="0" w:type="auto"/>
+          </w:tcPr>
+          <w:p>
+            <w:pPr>
+              <w:jc w:val="center"/>
+            </w:pPr>
+            <w:r>
+              <w:t>25/06/2024</w:t>
+            </w:r>
+          </w:p>
+        </w:tc>
+        <w:tc>
+          <w:tcPr>
+            <w:tcW w:w="0" w:type="auto"/>
+            <w:vAlign w:val="center"/>
+          </w:tcPr>
+          <w:p>
+            <w:pPr>
+              <w:jc w:val="center"/>
+              <w:cnfStyle w:val="000000000000" w:firstRow="0" w:lastRow="0" w:firstColumn="0" w:lastColumn="0" w:oddVBand="0" w:evenVBand="0" w:oddHBand="0" w:evenHBand="0" w:firstRowFirstColumn="0" w:firstRowLastColumn="0" w:lastRowFirstColumn="0" w:lastRowLastColumn="0"/>
+            </w:pPr>
+            <w:r>
+              <w:t>Implementación de Historial de Películas</w:t>
+            </w:r>
+          </w:p>
+        </w:tc>
+        <w:tc>
+          <w:tcPr>
+            <w:tcW w:w="0" w:type="auto"/>
+            <w:vAlign w:val="center"/>
+          </w:tcPr>
+          <w:p>
+            <w:pPr>
+              <w:jc w:val="center"/>
+              <w:cnfStyle w:val="000000000000" w:firstRow="0" w:lastRow="0" w:firstColumn="0" w:lastColumn="0" w:oddVBand="0" w:evenVBand="0" w:oddHBand="0" w:evenHBand="0" w:firstRowFirstColumn="0" w:firstRowLastColumn="0" w:lastRowFirstColumn="0" w:lastRowLastColumn="0"/>
+            </w:pPr>
+            <w:r>
+              <w:t>Backend</w:t>
+            </w:r>
+          </w:p>
+        </w:tc>
+      </w:tr>
+      <w:tr>
+        <w:trPr>
+          <w:cnfStyle w:val="000000100000" w:firstRow="0" w:lastRow="0" w:firstColumn="0" w:lastColumn="0" w:oddVBand="0" w:evenVBand="0" w:oddHBand="1" w:evenHBand="0" w:firstRowFirstColumn="0" w:firstRowLastColumn="0" w:lastRowFirstColumn="0" w:lastRowLastColumn="0"/>
+          <w:jc w:val="center"/>
+        </w:trPr>
+        <w:tc>
+          <w:tcPr>
+            <w:cnfStyle w:val="001000000000" w:firstRow="0" w:lastRow="0" w:firstColumn="1" w:lastColumn="0" w:oddVBand="0" w:evenVBand="0" w:oddHBand="0" w:evenHBand="0" w:firstRowFirstColumn="0" w:firstRowLastColumn="0" w:lastRowFirstColumn="0" w:lastRowLastColumn="0"/>
+            <w:tcW w:w="0" w:type="auto"/>
+          </w:tcPr>
+          <w:p>
+            <w:pPr>
+              <w:jc w:val="center"/>
+            </w:pPr>
+            <w:r>
+              <w:t>25/06/2024</w:t>
+            </w:r>
+          </w:p>
+        </w:tc>
+        <w:tc>
+          <w:tcPr>
+            <w:tcW w:w="0" w:type="auto"/>
+            <w:vAlign w:val="center"/>
+          </w:tcPr>
+          <w:p>
+            <w:pPr>
+              <w:jc w:val="center"/>
+              <w:cnfStyle w:val="000000100000" w:firstRow="0" w:lastRow="0" w:firstColumn="0" w:lastColumn="0" w:oddVBand="0" w:evenVBand="0" w:oddHBand="1" w:evenHBand="0" w:firstRowFirstColumn="0" w:firstRowLastColumn="0" w:lastRowFirstColumn="0" w:lastRowLastColumn="0"/>
+            </w:pPr>
+            <w:r>
+              <w:t>Autenticación de Login</w:t>
+            </w:r>
+          </w:p>
+        </w:tc>
+        <w:tc>
+          <w:tcPr>
+            <w:tcW w:w="0" w:type="auto"/>
+            <w:vAlign w:val="center"/>
+          </w:tcPr>
+          <w:p>
+            <w:pPr>
+              <w:jc w:val="center"/>
+              <w:cnfStyle w:val="000000100000" w:firstRow="0" w:lastRow="0" w:firstColumn="0" w:lastColumn="0" w:oddVBand="0" w:evenVBand="0" w:oddHBand="1" w:evenHBand="0" w:firstRowFirstColumn="0" w:firstRowLastColumn="0" w:lastRowFirstColumn="0" w:lastRowLastColumn="0"/>
+            </w:pPr>
+            <w:r>
+              <w:t>Frontend</w:t>
+            </w:r>
+          </w:p>
+        </w:tc>
+      </w:tr>
+      <w:tr>
+        <w:trPr>
+          <w:jc w:val="center"/>
+        </w:trPr>
+        <w:tc>
+          <w:tcPr>
+            <w:cnfStyle w:val="001000000000" w:firstRow="0" w:lastRow="0" w:firstColumn="1" w:lastColumn="0" w:oddVBand="0" w:evenVBand="0" w:oddHBand="0" w:evenHBand="0" w:firstRowFirstColumn="0" w:firstRowLastColumn="0" w:lastRowFirstColumn="0" w:lastRowLastColumn="0"/>
+            <w:tcW w:w="0" w:type="auto"/>
+          </w:tcPr>
+          <w:p>
+            <w:pPr>
+              <w:jc w:val="center"/>
+            </w:pPr>
+            <w:r>
+              <w:t>25/06/2024</w:t>
+            </w:r>
+          </w:p>
+        </w:tc>
+        <w:tc>
+          <w:tcPr>
+            <w:tcW w:w="0" w:type="auto"/>
+            <w:vAlign w:val="center"/>
+          </w:tcPr>
+          <w:p>
+            <w:pPr>
+              <w:jc w:val="center"/>
+              <w:cnfStyle w:val="000000000000" w:firstRow="0" w:lastRow="0" w:firstColumn="0" w:lastColumn="0" w:oddVBand="0" w:evenVBand="0" w:oddHBand="0" w:evenHBand="0" w:firstRowFirstColumn="0" w:firstRowLastColumn="0" w:lastRowFirstColumn="0" w:lastRowLastColumn="0"/>
+            </w:pPr>
+            <w:proofErr w:type="gramStart"/>
+            <w:r>
+              <w:t>Interface</w:t>
+            </w:r>
+            <w:proofErr w:type="gramEnd"/>
+            <w:r>
+              <w:t xml:space="preserve"> de Administrador</w:t>
+            </w:r>
+          </w:p>
+        </w:tc>
+        <w:tc>
+          <w:tcPr>
+            <w:tcW w:w="0" w:type="auto"/>
+            <w:vAlign w:val="center"/>
+          </w:tcPr>
+          <w:p>
+            <w:pPr>
+              <w:jc w:val="center"/>
+              <w:cnfStyle w:val="000000000000" w:firstRow="0" w:lastRow="0" w:firstColumn="0" w:lastColumn="0" w:oddVBand="0" w:evenVBand="0" w:oddHBand="0" w:evenHBand="0" w:firstRowFirstColumn="0" w:firstRowLastColumn="0" w:lastRowFirstColumn="0" w:lastRowLastColumn="0"/>
+            </w:pPr>
+            <w:r>
+              <w:t>Frontend</w:t>
+            </w:r>
+          </w:p>
+        </w:tc>
+      </w:tr>
+      <w:tr>
+        <w:trPr>
+          <w:cnfStyle w:val="000000100000" w:firstRow="0" w:lastRow="0" w:firstColumn="0" w:lastColumn="0" w:oddVBand="0" w:evenVBand="0" w:oddHBand="1" w:evenHBand="0" w:firstRowFirstColumn="0" w:firstRowLastColumn="0" w:lastRowFirstColumn="0" w:lastRowLastColumn="0"/>
+          <w:jc w:val="center"/>
+        </w:trPr>
+        <w:tc>
+          <w:tcPr>
+            <w:cnfStyle w:val="001000000000" w:firstRow="0" w:lastRow="0" w:firstColumn="1" w:lastColumn="0" w:oddVBand="0" w:evenVBand="0" w:oddHBand="0" w:evenHBand="0" w:firstRowFirstColumn="0" w:firstRowLastColumn="0" w:lastRowFirstColumn="0" w:lastRowLastColumn="0"/>
+            <w:tcW w:w="0" w:type="auto"/>
+          </w:tcPr>
+          <w:p>
+            <w:pPr>
+              <w:jc w:val="center"/>
+            </w:pPr>
+            <w:r>
+              <w:t>25/06/2024</w:t>
+            </w:r>
+          </w:p>
+        </w:tc>
+        <w:tc>
+          <w:tcPr>
+            <w:tcW w:w="0" w:type="auto"/>
+            <w:vAlign w:val="center"/>
+          </w:tcPr>
+          <w:p>
+            <w:pPr>
+              <w:jc w:val="center"/>
+              <w:cnfStyle w:val="000000100000" w:firstRow="0" w:lastRow="0" w:firstColumn="0" w:lastColumn="0" w:oddVBand="0" w:evenVBand="0" w:oddHBand="1" w:evenHBand="0" w:firstRowFirstColumn="0" w:firstRowLastColumn="0" w:lastRowFirstColumn="0" w:lastRowLastColumn="0"/>
+            </w:pPr>
+            <w:r>
+              <w:t>Agregar Pelicula</w:t>
+            </w:r>
+          </w:p>
+        </w:tc>
+        <w:tc>
+          <w:tcPr>
+            <w:tcW w:w="0" w:type="auto"/>
+            <w:vAlign w:val="center"/>
+          </w:tcPr>
+          <w:p>
+            <w:pPr>
+              <w:jc w:val="center"/>
+              <w:cnfStyle w:val="000000100000" w:firstRow="0" w:lastRow="0" w:firstColumn="0" w:lastColumn="0" w:oddVBand="0" w:evenVBand="0" w:oddHBand="1" w:evenHBand="0" w:firstRowFirstColumn="0" w:firstRowLastColumn="0" w:lastRowFirstColumn="0" w:lastRowLastColumn="0"/>
+            </w:pPr>
+            <w:r>
+              <w:t>Frontend</w:t>
+            </w:r>
+          </w:p>
+        </w:tc>
+      </w:tr>
+      <w:tr>
+        <w:trPr>
+          <w:jc w:val="center"/>
+        </w:trPr>
+        <w:tc>
+          <w:tcPr>
+            <w:cnfStyle w:val="001000000000" w:firstRow="0" w:lastRow="0" w:firstColumn="1" w:lastColumn="0" w:oddVBand="0" w:evenVBand="0" w:oddHBand="0" w:evenHBand="0" w:firstRowFirstColumn="0" w:firstRowLastColumn="0" w:lastRowFirstColumn="0" w:lastRowLastColumn="0"/>
+            <w:tcW w:w="0" w:type="auto"/>
+          </w:tcPr>
+          <w:p>
+            <w:pPr>
+              <w:jc w:val="center"/>
+            </w:pPr>
+            <w:r>
+              <w:t>25/06/2024</w:t>
+            </w:r>
+          </w:p>
+        </w:tc>
+        <w:tc>
+          <w:tcPr>
+            <w:tcW w:w="0" w:type="auto"/>
+            <w:vAlign w:val="center"/>
+          </w:tcPr>
+          <w:p>
+            <w:pPr>
+              <w:jc w:val="center"/>
+              <w:cnfStyle w:val="000000000000" w:firstRow="0" w:lastRow="0" w:firstColumn="0" w:lastColumn="0" w:oddVBand="0" w:evenVBand="0" w:oddHBand="0" w:evenHBand="0" w:firstRowFirstColumn="0" w:firstRowLastColumn="0" w:lastRowFirstColumn="0" w:lastRowLastColumn="0"/>
+            </w:pPr>
+            <w:r>
+              <w:t>Actualizar Pelicula</w:t>
+            </w:r>
+          </w:p>
+        </w:tc>
+        <w:tc>
+          <w:tcPr>
+            <w:tcW w:w="0" w:type="auto"/>
+            <w:vAlign w:val="center"/>
+          </w:tcPr>
+          <w:p>
+            <w:pPr>
+              <w:jc w:val="center"/>
+              <w:cnfStyle w:val="000000000000" w:firstRow="0" w:lastRow="0" w:firstColumn="0" w:lastColumn="0" w:oddVBand="0" w:evenVBand="0" w:oddHBand="0" w:evenHBand="0" w:firstRowFirstColumn="0" w:firstRowLastColumn="0" w:lastRowFirstColumn="0" w:lastRowLastColumn="0"/>
+            </w:pPr>
+            <w:r>
+              <w:t>Frontend</w:t>
+            </w:r>
+          </w:p>
+        </w:tc>
+      </w:tr>
+      <w:tr>
+        <w:trPr>
+          <w:cnfStyle w:val="000000100000" w:firstRow="0" w:lastRow="0" w:firstColumn="0" w:lastColumn="0" w:oddVBand="0" w:evenVBand="0" w:oddHBand="1" w:evenHBand="0" w:firstRowFirstColumn="0" w:firstRowLastColumn="0" w:lastRowFirstColumn="0" w:lastRowLastColumn="0"/>
+          <w:jc w:val="center"/>
+        </w:trPr>
+        <w:tc>
+          <w:tcPr>
+            <w:cnfStyle w:val="001000000000" w:firstRow="0" w:lastRow="0" w:firstColumn="1" w:lastColumn="0" w:oddVBand="0" w:evenVBand="0" w:oddHBand="0" w:evenHBand="0" w:firstRowFirstColumn="0" w:firstRowLastColumn="0" w:lastRowFirstColumn="0" w:lastRowLastColumn="0"/>
+            <w:tcW w:w="0" w:type="auto"/>
+          </w:tcPr>
+          <w:p>
+            <w:pPr>
+              <w:jc w:val="center"/>
+            </w:pPr>
+            <w:r>
+              <w:t>25/06/2024</w:t>
+            </w:r>
+          </w:p>
+        </w:tc>
+        <w:tc>
+          <w:tcPr>
+            <w:tcW w:w="0" w:type="auto"/>
+            <w:vAlign w:val="center"/>
+          </w:tcPr>
+          <w:p>
+            <w:pPr>
+              <w:jc w:val="center"/>
+              <w:cnfStyle w:val="000000100000" w:firstRow="0" w:lastRow="0" w:firstColumn="0" w:lastColumn="0" w:oddVBand="0" w:evenVBand="0" w:oddHBand="1" w:evenHBand="0" w:firstRowFirstColumn="0" w:firstRowLastColumn="0" w:lastRowFirstColumn="0" w:lastRowLastColumn="0"/>
+            </w:pPr>
+            <w:r>
+              <w:t>Eliminar Usuario</w:t>
+            </w:r>
+          </w:p>
+        </w:tc>
+        <w:tc>
+          <w:tcPr>
+            <w:tcW w:w="0" w:type="auto"/>
+            <w:vAlign w:val="center"/>
+          </w:tcPr>
+          <w:p>
+            <w:pPr>
+              <w:jc w:val="center"/>
+              <w:cnfStyle w:val="000000100000" w:firstRow="0" w:lastRow="0" w:firstColumn="0" w:lastColumn="0" w:oddVBand="0" w:evenVBand="0" w:oddHBand="1" w:evenHBand="0" w:firstRowFirstColumn="0" w:firstRowLastColumn="0" w:lastRowFirstColumn="0" w:lastRowLastColumn="0"/>
+            </w:pPr>
+            <w:r>
+              <w:t>Frontend</w:t>
+            </w:r>
+          </w:p>
+        </w:tc>
+      </w:tr>
+      <w:tr>
+        <w:trPr>
+          <w:jc w:val="center"/>
+        </w:trPr>
+        <w:tc>
+          <w:tcPr>
+            <w:cnfStyle w:val="001000000000" w:firstRow="0" w:lastRow="0" w:firstColumn="1" w:lastColumn="0" w:oddVBand="0" w:evenVBand="0" w:oddHBand="0" w:evenHBand="0" w:firstRowFirstColumn="0" w:firstRowLastColumn="0" w:lastRowFirstColumn="0" w:lastRowLastColumn="0"/>
+            <w:tcW w:w="0" w:type="auto"/>
+          </w:tcPr>
+          <w:p>
+            <w:pPr>
+              <w:jc w:val="center"/>
+            </w:pPr>
+            <w:r>
+              <w:t>25/06/2024</w:t>
+            </w:r>
+          </w:p>
+        </w:tc>
+        <w:tc>
+          <w:tcPr>
+            <w:tcW w:w="0" w:type="auto"/>
+            <w:vAlign w:val="center"/>
+          </w:tcPr>
+          <w:p>
+            <w:pPr>
+              <w:jc w:val="center"/>
+              <w:cnfStyle w:val="000000000000" w:firstRow="0" w:lastRow="0" w:firstColumn="0" w:lastColumn="0" w:oddVBand="0" w:evenVBand="0" w:oddHBand="0" w:evenHBand="0" w:firstRowFirstColumn="0" w:firstRowLastColumn="0" w:lastRowFirstColumn="0" w:lastRowLastColumn="0"/>
+            </w:pPr>
+            <w:r>
+              <w:t>Eliminar Pelicula</w:t>
+            </w:r>
+          </w:p>
+        </w:tc>
+        <w:tc>
+          <w:tcPr>
+            <w:tcW w:w="0" w:type="auto"/>
+            <w:vAlign w:val="center"/>
+          </w:tcPr>
+          <w:p>
+            <w:pPr>
+              <w:jc w:val="center"/>
+              <w:cnfStyle w:val="000000000000" w:firstRow="0" w:lastRow="0" w:firstColumn="0" w:lastColumn="0" w:oddVBand="0" w:evenVBand="0" w:oddHBand="0" w:evenHBand="0" w:firstRowFirstColumn="0" w:firstRowLastColumn="0" w:lastRowFirstColumn="0" w:lastRowLastColumn="0"/>
+            </w:pPr>
+            <w:r>
+              <w:t>Frontend</w:t>
+            </w:r>
+          </w:p>
+        </w:tc>
+      </w:tr>
+      <w:tr>
+        <w:trPr>
+          <w:cnfStyle w:val="000000100000" w:firstRow="0" w:lastRow="0" w:firstColumn="0" w:lastColumn="0" w:oddVBand="0" w:evenVBand="0" w:oddHBand="1" w:evenHBand="0" w:firstRowFirstColumn="0" w:firstRowLastColumn="0" w:lastRowFirstColumn="0" w:lastRowLastColumn="0"/>
+          <w:jc w:val="center"/>
+        </w:trPr>
+        <w:tc>
+          <w:tcPr>
+            <w:cnfStyle w:val="001000000000" w:firstRow="0" w:lastRow="0" w:firstColumn="1" w:lastColumn="0" w:oddVBand="0" w:evenVBand="0" w:oddHBand="0" w:evenHBand="0" w:firstRowFirstColumn="0" w:firstRowLastColumn="0" w:lastRowFirstColumn="0" w:lastRowLastColumn="0"/>
+            <w:tcW w:w="0" w:type="auto"/>
+          </w:tcPr>
+          <w:p>
+            <w:pPr>
+              <w:jc w:val="center"/>
+            </w:pPr>
+            <w:r>
+              <w:t>25/06/2024</w:t>
+            </w:r>
+          </w:p>
+        </w:tc>
+        <w:tc>
+          <w:tcPr>
+            <w:tcW w:w="0" w:type="auto"/>
+            <w:vAlign w:val="center"/>
+          </w:tcPr>
+          <w:p>
+            <w:pPr>
+              <w:jc w:val="center"/>
+              <w:cnfStyle w:val="000000100000" w:firstRow="0" w:lastRow="0" w:firstColumn="0" w:lastColumn="0" w:oddVBand="0" w:evenVBand="0" w:oddHBand="1" w:evenHBand="0" w:firstRowFirstColumn="0" w:firstRowLastColumn="0" w:lastRowFirstColumn="0" w:lastRowLastColumn="0"/>
+            </w:pPr>
+            <w:r>
+              <w:t>Mostrar Pelicula Y Usuarios</w:t>
+            </w:r>
+          </w:p>
+        </w:tc>
+        <w:tc>
+          <w:tcPr>
+            <w:tcW w:w="0" w:type="auto"/>
+            <w:vAlign w:val="center"/>
+          </w:tcPr>
+          <w:p>
+            <w:pPr>
+              <w:jc w:val="center"/>
+              <w:cnfStyle w:val="000000100000" w:firstRow="0" w:lastRow="0" w:firstColumn="0" w:lastColumn="0" w:oddVBand="0" w:evenVBand="0" w:oddHBand="1" w:evenHBand="0" w:firstRowFirstColumn="0" w:firstRowLastColumn="0" w:lastRowFirstColumn="0" w:lastRowLastColumn="0"/>
+            </w:pPr>
+            <w:r>
+              <w:t>Frontend</w:t>
             </w:r>
           </w:p>
         </w:tc>

</xml_diff>

<commit_message>
Metodos para alquilar y devolver pelicula
funcionalidad de los metodos POST PUT GET DELETE para poder alquilar peliculas y ver ihistorial de las peliculas y ver el estado de las peliculas
</commit_message>
<xml_diff>
--- a/CRONOGRAMA.docx
+++ b/CRONOGRAMA.docx
@@ -2732,6 +2732,263 @@
             <w:pPr>
               <w:jc w:val="center"/>
               <w:cnfStyle w:val="000000100000" w:firstRow="0" w:lastRow="0" w:firstColumn="0" w:lastColumn="0" w:oddVBand="0" w:evenVBand="0" w:oddHBand="1" w:evenHBand="0" w:firstRowFirstColumn="0" w:firstRowLastColumn="0" w:lastRowFirstColumn="0" w:lastRowLastColumn="0"/>
+            </w:pPr>
+            <w:r>
+              <w:t>Frontend</w:t>
+            </w:r>
+          </w:p>
+        </w:tc>
+      </w:tr>
+      <w:tr>
+        <w:trPr>
+          <w:jc w:val="center"/>
+        </w:trPr>
+        <w:tc>
+          <w:tcPr>
+            <w:cnfStyle w:val="001000000000" w:firstRow="0" w:lastRow="0" w:firstColumn="1" w:lastColumn="0" w:oddVBand="0" w:evenVBand="0" w:oddHBand="0" w:evenHBand="0" w:firstRowFirstColumn="0" w:firstRowLastColumn="0" w:lastRowFirstColumn="0" w:lastRowLastColumn="0"/>
+            <w:tcW w:w="0" w:type="auto"/>
+            <w:vAlign w:val="center"/>
+          </w:tcPr>
+          <w:p>
+            <w:pPr>
+              <w:jc w:val="center"/>
+            </w:pPr>
+            <w:r>
+              <w:t>24/06/2024</w:t>
+            </w:r>
+          </w:p>
+        </w:tc>
+        <w:tc>
+          <w:tcPr>
+            <w:tcW w:w="0" w:type="auto"/>
+            <w:vAlign w:val="center"/>
+          </w:tcPr>
+          <w:p>
+            <w:pPr>
+              <w:jc w:val="center"/>
+              <w:cnfStyle w:val="000000000000" w:firstRow="0" w:lastRow="0" w:firstColumn="0" w:lastColumn="0" w:oddVBand="0" w:evenVBand="0" w:oddHBand="0" w:evenHBand="0" w:firstRowFirstColumn="0" w:firstRowLastColumn="0" w:lastRowFirstColumn="0" w:lastRowLastColumn="0"/>
+            </w:pPr>
+            <w:r>
+              <w:t>Implementación de la lógica del Frontend para las funciones del Administrador</w:t>
+            </w:r>
+          </w:p>
+        </w:tc>
+        <w:tc>
+          <w:tcPr>
+            <w:tcW w:w="0" w:type="auto"/>
+            <w:vAlign w:val="center"/>
+          </w:tcPr>
+          <w:p>
+            <w:pPr>
+              <w:jc w:val="center"/>
+              <w:cnfStyle w:val="000000000000" w:firstRow="0" w:lastRow="0" w:firstColumn="0" w:lastColumn="0" w:oddVBand="0" w:evenVBand="0" w:oddHBand="0" w:evenHBand="0" w:firstRowFirstColumn="0" w:firstRowLastColumn="0" w:lastRowFirstColumn="0" w:lastRowLastColumn="0"/>
+            </w:pPr>
+            <w:r>
+              <w:t>Frontend</w:t>
+            </w:r>
+          </w:p>
+        </w:tc>
+      </w:tr>
+      <w:tr>
+        <w:trPr>
+          <w:cnfStyle w:val="000000100000" w:firstRow="0" w:lastRow="0" w:firstColumn="0" w:lastColumn="0" w:oddVBand="0" w:evenVBand="0" w:oddHBand="1" w:evenHBand="0" w:firstRowFirstColumn="0" w:firstRowLastColumn="0" w:lastRowFirstColumn="0" w:lastRowLastColumn="0"/>
+          <w:jc w:val="center"/>
+        </w:trPr>
+        <w:tc>
+          <w:tcPr>
+            <w:cnfStyle w:val="001000000000" w:firstRow="0" w:lastRow="0" w:firstColumn="1" w:lastColumn="0" w:oddVBand="0" w:evenVBand="0" w:oddHBand="0" w:evenHBand="0" w:firstRowFirstColumn="0" w:firstRowLastColumn="0" w:lastRowFirstColumn="0" w:lastRowLastColumn="0"/>
+            <w:tcW w:w="0" w:type="auto"/>
+            <w:vAlign w:val="center"/>
+          </w:tcPr>
+          <w:p>
+            <w:pPr>
+              <w:jc w:val="center"/>
+            </w:pPr>
+            <w:r>
+              <w:t>25/06/2024</w:t>
+            </w:r>
+          </w:p>
+        </w:tc>
+        <w:tc>
+          <w:tcPr>
+            <w:tcW w:w="0" w:type="auto"/>
+            <w:vAlign w:val="center"/>
+          </w:tcPr>
+          <w:p>
+            <w:pPr>
+              <w:jc w:val="center"/>
+              <w:cnfStyle w:val="000000100000" w:firstRow="0" w:lastRow="0" w:firstColumn="0" w:lastColumn="0" w:oddVBand="0" w:evenVBand="0" w:oddHBand="1" w:evenHBand="0" w:firstRowFirstColumn="0" w:firstRowLastColumn="0" w:lastRowFirstColumn="0" w:lastRowLastColumn="0"/>
+            </w:pPr>
+            <w:r>
+              <w:t>Arreglo de lógica del Frontend de Inicio de Sesión</w:t>
+            </w:r>
+          </w:p>
+        </w:tc>
+        <w:tc>
+          <w:tcPr>
+            <w:tcW w:w="0" w:type="auto"/>
+            <w:vAlign w:val="center"/>
+          </w:tcPr>
+          <w:p>
+            <w:pPr>
+              <w:jc w:val="center"/>
+              <w:cnfStyle w:val="000000100000" w:firstRow="0" w:lastRow="0" w:firstColumn="0" w:lastColumn="0" w:oddVBand="0" w:evenVBand="0" w:oddHBand="1" w:evenHBand="0" w:firstRowFirstColumn="0" w:firstRowLastColumn="0" w:lastRowFirstColumn="0" w:lastRowLastColumn="0"/>
+            </w:pPr>
+            <w:r>
+              <w:t>Frontend</w:t>
+            </w:r>
+          </w:p>
+        </w:tc>
+      </w:tr>
+      <w:tr>
+        <w:trPr>
+          <w:jc w:val="center"/>
+        </w:trPr>
+        <w:tc>
+          <w:tcPr>
+            <w:cnfStyle w:val="001000000000" w:firstRow="0" w:lastRow="0" w:firstColumn="1" w:lastColumn="0" w:oddVBand="0" w:evenVBand="0" w:oddHBand="0" w:evenHBand="0" w:firstRowFirstColumn="0" w:firstRowLastColumn="0" w:lastRowFirstColumn="0" w:lastRowLastColumn="0"/>
+            <w:tcW w:w="0" w:type="auto"/>
+            <w:vAlign w:val="center"/>
+          </w:tcPr>
+          <w:p>
+            <w:pPr>
+              <w:jc w:val="center"/>
+            </w:pPr>
+            <w:r>
+              <w:t>25/06/2024</w:t>
+            </w:r>
+          </w:p>
+        </w:tc>
+        <w:tc>
+          <w:tcPr>
+            <w:tcW w:w="0" w:type="auto"/>
+            <w:vAlign w:val="center"/>
+          </w:tcPr>
+          <w:p>
+            <w:pPr>
+              <w:jc w:val="center"/>
+              <w:cnfStyle w:val="000000000000" w:firstRow="0" w:lastRow="0" w:firstColumn="0" w:lastColumn="0" w:oddVBand="0" w:evenVBand="0" w:oddHBand="0" w:evenHBand="0" w:firstRowFirstColumn="0" w:firstRowLastColumn="0" w:lastRowFirstColumn="0" w:lastRowLastColumn="0"/>
+            </w:pPr>
+            <w:r>
+              <w:t>Creación de página de Usuario junto con las páginas de sus funciones</w:t>
+            </w:r>
+          </w:p>
+        </w:tc>
+        <w:tc>
+          <w:tcPr>
+            <w:tcW w:w="0" w:type="auto"/>
+            <w:vAlign w:val="center"/>
+          </w:tcPr>
+          <w:p>
+            <w:pPr>
+              <w:jc w:val="center"/>
+              <w:cnfStyle w:val="000000000000" w:firstRow="0" w:lastRow="0" w:firstColumn="0" w:lastColumn="0" w:oddVBand="0" w:evenVBand="0" w:oddHBand="0" w:evenHBand="0" w:firstRowFirstColumn="0" w:firstRowLastColumn="0" w:lastRowFirstColumn="0" w:lastRowLastColumn="0"/>
+            </w:pPr>
+            <w:r>
+              <w:t>Frontend</w:t>
+            </w:r>
+          </w:p>
+        </w:tc>
+      </w:tr>
+      <w:tr>
+        <w:trPr>
+          <w:cnfStyle w:val="000000100000" w:firstRow="0" w:lastRow="0" w:firstColumn="0" w:lastColumn="0" w:oddVBand="0" w:evenVBand="0" w:oddHBand="1" w:evenHBand="0" w:firstRowFirstColumn="0" w:firstRowLastColumn="0" w:lastRowFirstColumn="0" w:lastRowLastColumn="0"/>
+          <w:jc w:val="center"/>
+        </w:trPr>
+        <w:tc>
+          <w:tcPr>
+            <w:cnfStyle w:val="001000000000" w:firstRow="0" w:lastRow="0" w:firstColumn="1" w:lastColumn="0" w:oddVBand="0" w:evenVBand="0" w:oddHBand="0" w:evenHBand="0" w:firstRowFirstColumn="0" w:firstRowLastColumn="0" w:lastRowFirstColumn="0" w:lastRowLastColumn="0"/>
+            <w:tcW w:w="0" w:type="auto"/>
+            <w:vAlign w:val="center"/>
+          </w:tcPr>
+          <w:p>
+            <w:pPr>
+              <w:jc w:val="center"/>
+            </w:pPr>
+            <w:r>
+              <w:t>25/06/2024</w:t>
+            </w:r>
+          </w:p>
+        </w:tc>
+        <w:tc>
+          <w:tcPr>
+            <w:tcW w:w="0" w:type="auto"/>
+            <w:vAlign w:val="center"/>
+          </w:tcPr>
+          <w:p>
+            <w:pPr>
+              <w:jc w:val="center"/>
+              <w:cnfStyle w:val="000000100000" w:firstRow="0" w:lastRow="0" w:firstColumn="0" w:lastColumn="0" w:oddVBand="0" w:evenVBand="0" w:oddHBand="1" w:evenHBand="0" w:firstRowFirstColumn="0" w:firstRowLastColumn="0" w:lastRowFirstColumn="0" w:lastRowLastColumn="0"/>
+            </w:pPr>
+            <w:r>
+              <w:t>Diseño de páginas de Usuario y poner sus componentes</w:t>
+            </w:r>
+          </w:p>
+        </w:tc>
+        <w:tc>
+          <w:tcPr>
+            <w:tcW w:w="0" w:type="auto"/>
+            <w:vAlign w:val="center"/>
+          </w:tcPr>
+          <w:p>
+            <w:pPr>
+              <w:jc w:val="center"/>
+              <w:cnfStyle w:val="000000100000" w:firstRow="0" w:lastRow="0" w:firstColumn="0" w:lastColumn="0" w:oddVBand="0" w:evenVBand="0" w:oddHBand="1" w:evenHBand="0" w:firstRowFirstColumn="0" w:firstRowLastColumn="0" w:lastRowFirstColumn="0" w:lastRowLastColumn="0"/>
+            </w:pPr>
+            <w:r>
+              <w:t>Frontend</w:t>
+            </w:r>
+          </w:p>
+        </w:tc>
+      </w:tr>
+      <w:tr>
+        <w:trPr>
+          <w:jc w:val="center"/>
+        </w:trPr>
+        <w:tc>
+          <w:tcPr>
+            <w:cnfStyle w:val="001000000000" w:firstRow="0" w:lastRow="0" w:firstColumn="1" w:lastColumn="0" w:oddVBand="0" w:evenVBand="0" w:oddHBand="0" w:evenHBand="0" w:firstRowFirstColumn="0" w:firstRowLastColumn="0" w:lastRowFirstColumn="0" w:lastRowLastColumn="0"/>
+            <w:tcW w:w="0" w:type="auto"/>
+            <w:vAlign w:val="center"/>
+          </w:tcPr>
+          <w:p>
+            <w:pPr>
+              <w:jc w:val="center"/>
+            </w:pPr>
+            <w:r>
+              <w:t>25/06/2024</w:t>
+            </w:r>
+          </w:p>
+        </w:tc>
+        <w:tc>
+          <w:tcPr>
+            <w:tcW w:w="0" w:type="auto"/>
+            <w:vAlign w:val="center"/>
+          </w:tcPr>
+          <w:p>
+            <w:pPr>
+              <w:jc w:val="center"/>
+              <w:cnfStyle w:val="000000000000" w:firstRow="0" w:lastRow="0" w:firstColumn="0" w:lastColumn="0" w:oddVBand="0" w:evenVBand="0" w:oddHBand="0" w:evenHBand="0" w:firstRowFirstColumn="0" w:firstRowLastColumn="0" w:lastRowFirstColumn="0" w:lastRowLastColumn="0"/>
+            </w:pPr>
+            <w:r>
+              <w:t xml:space="preserve">Visualización de catálogo de </w:t>
+            </w:r>
+            <w:proofErr w:type="spellStart"/>
+            <w:r>
+              <w:t>peliculas</w:t>
+            </w:r>
+            <w:proofErr w:type="spellEnd"/>
+          </w:p>
+        </w:tc>
+        <w:tc>
+          <w:tcPr>
+            <w:tcW w:w="0" w:type="auto"/>
+            <w:vAlign w:val="center"/>
+          </w:tcPr>
+          <w:p>
+            <w:pPr>
+              <w:jc w:val="center"/>
+              <w:cnfStyle w:val="000000000000" w:firstRow="0" w:lastRow="0" w:firstColumn="0" w:lastColumn="0" w:oddVBand="0" w:evenVBand="0" w:oddHBand="0" w:evenHBand="0" w:firstRowFirstColumn="0" w:firstRowLastColumn="0" w:lastRowFirstColumn="0" w:lastRowLastColumn="0"/>
             </w:pPr>
             <w:r>
               <w:t>Frontend</w:t>

</xml_diff>

<commit_message>
Finalización de Roll Admin
Finalización de la funcionalidad de administrador al 100%
</commit_message>
<xml_diff>
--- a/CRONOGRAMA.docx
+++ b/CRONOGRAMA.docx
@@ -2317,6 +2317,297 @@
           </w:p>
         </w:tc>
       </w:tr>
+      <w:tr>
+        <w:trPr>
+          <w:jc w:val="center"/>
+        </w:trPr>
+        <w:tc>
+          <w:tcPr>
+            <w:cnfStyle w:val="001000000000" w:firstRow="0" w:lastRow="0" w:firstColumn="1" w:lastColumn="0" w:oddVBand="0" w:evenVBand="0" w:oddHBand="0" w:evenHBand="0" w:firstRowFirstColumn="0" w:firstRowLastColumn="0" w:lastRowFirstColumn="0" w:lastRowLastColumn="0"/>
+            <w:tcW w:w="0" w:type="auto"/>
+          </w:tcPr>
+          <w:p>
+            <w:pPr>
+              <w:jc w:val="center"/>
+            </w:pPr>
+            <w:r>
+              <w:t>26/02/2024</w:t>
+            </w:r>
+          </w:p>
+        </w:tc>
+        <w:tc>
+          <w:tcPr>
+            <w:tcW w:w="0" w:type="auto"/>
+            <w:vAlign w:val="center"/>
+          </w:tcPr>
+          <w:p>
+            <w:pPr>
+              <w:jc w:val="center"/>
+              <w:cnfStyle w:val="000000000000" w:firstRow="0" w:lastRow="0" w:firstColumn="0" w:lastColumn="0" w:oddVBand="0" w:evenVBand="0" w:oddHBand="0" w:evenHBand="0" w:firstRowFirstColumn="0" w:firstRowLastColumn="0" w:lastRowFirstColumn="0" w:lastRowLastColumn="0"/>
+            </w:pPr>
+            <w:r>
+              <w:t>Funcionalidad de poder eliminar pelicula</w:t>
+            </w:r>
+          </w:p>
+        </w:tc>
+        <w:tc>
+          <w:tcPr>
+            <w:tcW w:w="0" w:type="auto"/>
+          </w:tcPr>
+          <w:p>
+            <w:pPr>
+              <w:jc w:val="center"/>
+              <w:cnfStyle w:val="000000000000" w:firstRow="0" w:lastRow="0" w:firstColumn="0" w:lastColumn="0" w:oddVBand="0" w:evenVBand="0" w:oddHBand="0" w:evenHBand="0" w:firstRowFirstColumn="0" w:firstRowLastColumn="0" w:lastRowFirstColumn="0" w:lastRowLastColumn="0"/>
+            </w:pPr>
+            <w:r>
+              <w:t>Frontend</w:t>
+            </w:r>
+          </w:p>
+        </w:tc>
+      </w:tr>
+      <w:tr>
+        <w:trPr>
+          <w:cnfStyle w:val="000000100000" w:firstRow="0" w:lastRow="0" w:firstColumn="0" w:lastColumn="0" w:oddVBand="0" w:evenVBand="0" w:oddHBand="1" w:evenHBand="0" w:firstRowFirstColumn="0" w:firstRowLastColumn="0" w:lastRowFirstColumn="0" w:lastRowLastColumn="0"/>
+          <w:jc w:val="center"/>
+        </w:trPr>
+        <w:tc>
+          <w:tcPr>
+            <w:cnfStyle w:val="001000000000" w:firstRow="0" w:lastRow="0" w:firstColumn="1" w:lastColumn="0" w:oddVBand="0" w:evenVBand="0" w:oddHBand="0" w:evenHBand="0" w:firstRowFirstColumn="0" w:firstRowLastColumn="0" w:lastRowFirstColumn="0" w:lastRowLastColumn="0"/>
+            <w:tcW w:w="0" w:type="auto"/>
+          </w:tcPr>
+          <w:p>
+            <w:pPr>
+              <w:jc w:val="center"/>
+            </w:pPr>
+            <w:r>
+              <w:t>26/02/2024</w:t>
+            </w:r>
+          </w:p>
+        </w:tc>
+        <w:tc>
+          <w:tcPr>
+            <w:tcW w:w="0" w:type="auto"/>
+            <w:vAlign w:val="center"/>
+          </w:tcPr>
+          <w:p>
+            <w:pPr>
+              <w:jc w:val="center"/>
+              <w:cnfStyle w:val="000000100000" w:firstRow="0" w:lastRow="0" w:firstColumn="0" w:lastColumn="0" w:oddVBand="0" w:evenVBand="0" w:oddHBand="1" w:evenHBand="0" w:firstRowFirstColumn="0" w:firstRowLastColumn="0" w:lastRowFirstColumn="0" w:lastRowLastColumn="0"/>
+            </w:pPr>
+            <w:r>
+              <w:t>Mostrar Todos los Usuarios</w:t>
+            </w:r>
+          </w:p>
+        </w:tc>
+        <w:tc>
+          <w:tcPr>
+            <w:tcW w:w="0" w:type="auto"/>
+          </w:tcPr>
+          <w:p>
+            <w:pPr>
+              <w:jc w:val="center"/>
+              <w:cnfStyle w:val="000000100000" w:firstRow="0" w:lastRow="0" w:firstColumn="0" w:lastColumn="0" w:oddVBand="0" w:evenVBand="0" w:oddHBand="1" w:evenHBand="0" w:firstRowFirstColumn="0" w:firstRowLastColumn="0" w:lastRowFirstColumn="0" w:lastRowLastColumn="0"/>
+            </w:pPr>
+            <w:r>
+              <w:t>Frontend</w:t>
+            </w:r>
+          </w:p>
+        </w:tc>
+      </w:tr>
+      <w:tr>
+        <w:trPr>
+          <w:jc w:val="center"/>
+        </w:trPr>
+        <w:tc>
+          <w:tcPr>
+            <w:cnfStyle w:val="001000000000" w:firstRow="0" w:lastRow="0" w:firstColumn="1" w:lastColumn="0" w:oddVBand="0" w:evenVBand="0" w:oddHBand="0" w:evenHBand="0" w:firstRowFirstColumn="0" w:firstRowLastColumn="0" w:lastRowFirstColumn="0" w:lastRowLastColumn="0"/>
+            <w:tcW w:w="0" w:type="auto"/>
+          </w:tcPr>
+          <w:p>
+            <w:pPr>
+              <w:jc w:val="center"/>
+            </w:pPr>
+            <w:r>
+              <w:t>26/02/2024</w:t>
+            </w:r>
+          </w:p>
+        </w:tc>
+        <w:tc>
+          <w:tcPr>
+            <w:tcW w:w="0" w:type="auto"/>
+            <w:vAlign w:val="center"/>
+          </w:tcPr>
+          <w:p>
+            <w:pPr>
+              <w:jc w:val="center"/>
+              <w:cnfStyle w:val="000000000000" w:firstRow="0" w:lastRow="0" w:firstColumn="0" w:lastColumn="0" w:oddVBand="0" w:evenVBand="0" w:oddHBand="0" w:evenHBand="0" w:firstRowFirstColumn="0" w:firstRowLastColumn="0" w:lastRowFirstColumn="0" w:lastRowLastColumn="0"/>
+            </w:pPr>
+            <w:r>
+              <w:t>Mostrar todas las Películas</w:t>
+            </w:r>
+          </w:p>
+        </w:tc>
+        <w:tc>
+          <w:tcPr>
+            <w:tcW w:w="0" w:type="auto"/>
+          </w:tcPr>
+          <w:p>
+            <w:pPr>
+              <w:jc w:val="center"/>
+              <w:cnfStyle w:val="000000000000" w:firstRow="0" w:lastRow="0" w:firstColumn="0" w:lastColumn="0" w:oddVBand="0" w:evenVBand="0" w:oddHBand="0" w:evenHBand="0" w:firstRowFirstColumn="0" w:firstRowLastColumn="0" w:lastRowFirstColumn="0" w:lastRowLastColumn="0"/>
+            </w:pPr>
+            <w:r>
+              <w:t>Frontend</w:t>
+            </w:r>
+          </w:p>
+        </w:tc>
+      </w:tr>
+      <w:tr>
+        <w:trPr>
+          <w:cnfStyle w:val="000000100000" w:firstRow="0" w:lastRow="0" w:firstColumn="0" w:lastColumn="0" w:oddVBand="0" w:evenVBand="0" w:oddHBand="1" w:evenHBand="0" w:firstRowFirstColumn="0" w:firstRowLastColumn="0" w:lastRowFirstColumn="0" w:lastRowLastColumn="0"/>
+          <w:jc w:val="center"/>
+        </w:trPr>
+        <w:tc>
+          <w:tcPr>
+            <w:cnfStyle w:val="001000000000" w:firstRow="0" w:lastRow="0" w:firstColumn="1" w:lastColumn="0" w:oddVBand="0" w:evenVBand="0" w:oddHBand="0" w:evenHBand="0" w:firstRowFirstColumn="0" w:firstRowLastColumn="0" w:lastRowFirstColumn="0" w:lastRowLastColumn="0"/>
+            <w:tcW w:w="0" w:type="auto"/>
+          </w:tcPr>
+          <w:p>
+            <w:pPr>
+              <w:jc w:val="center"/>
+            </w:pPr>
+            <w:r>
+              <w:t>26/02/2024</w:t>
+            </w:r>
+          </w:p>
+        </w:tc>
+        <w:tc>
+          <w:tcPr>
+            <w:tcW w:w="0" w:type="auto"/>
+            <w:vAlign w:val="center"/>
+          </w:tcPr>
+          <w:p>
+            <w:pPr>
+              <w:jc w:val="center"/>
+              <w:cnfStyle w:val="000000100000" w:firstRow="0" w:lastRow="0" w:firstColumn="0" w:lastColumn="0" w:oddVBand="0" w:evenVBand="0" w:oddHBand="1" w:evenHBand="0" w:firstRowFirstColumn="0" w:firstRowLastColumn="0" w:lastRowFirstColumn="0" w:lastRowLastColumn="0"/>
+            </w:pPr>
+            <w:r>
+              <w:t xml:space="preserve">Edpoint de </w:t>
+            </w:r>
+            <w:r>
+              <w:t>mostrar historial de películas alquiladas</w:t>
+            </w:r>
+          </w:p>
+        </w:tc>
+        <w:tc>
+          <w:tcPr>
+            <w:tcW w:w="0" w:type="auto"/>
+            <w:vAlign w:val="center"/>
+          </w:tcPr>
+          <w:p>
+            <w:pPr>
+              <w:jc w:val="center"/>
+              <w:cnfStyle w:val="000000100000" w:firstRow="0" w:lastRow="0" w:firstColumn="0" w:lastColumn="0" w:oddVBand="0" w:evenVBand="0" w:oddHBand="1" w:evenHBand="0" w:firstRowFirstColumn="0" w:firstRowLastColumn="0" w:lastRowFirstColumn="0" w:lastRowLastColumn="0"/>
+            </w:pPr>
+          </w:p>
+        </w:tc>
+      </w:tr>
+      <w:tr>
+        <w:trPr>
+          <w:jc w:val="center"/>
+        </w:trPr>
+        <w:tc>
+          <w:tcPr>
+            <w:cnfStyle w:val="001000000000" w:firstRow="0" w:lastRow="0" w:firstColumn="1" w:lastColumn="0" w:oddVBand="0" w:evenVBand="0" w:oddHBand="0" w:evenHBand="0" w:firstRowFirstColumn="0" w:firstRowLastColumn="0" w:lastRowFirstColumn="0" w:lastRowLastColumn="0"/>
+            <w:tcW w:w="0" w:type="auto"/>
+          </w:tcPr>
+          <w:p>
+            <w:pPr>
+              <w:jc w:val="center"/>
+            </w:pPr>
+            <w:r>
+              <w:t>26/02/2024</w:t>
+            </w:r>
+          </w:p>
+        </w:tc>
+        <w:tc>
+          <w:tcPr>
+            <w:tcW w:w="0" w:type="auto"/>
+            <w:vAlign w:val="center"/>
+          </w:tcPr>
+          <w:p>
+            <w:pPr>
+              <w:jc w:val="center"/>
+              <w:cnfStyle w:val="000000000000" w:firstRow="0" w:lastRow="0" w:firstColumn="0" w:lastColumn="0" w:oddVBand="0" w:evenVBand="0" w:oddHBand="0" w:evenHBand="0" w:firstRowFirstColumn="0" w:firstRowLastColumn="0" w:lastRowFirstColumn="0" w:lastRowLastColumn="0"/>
+              <w:rPr>
+                <w:u w:val="single"/>
+              </w:rPr>
+            </w:pPr>
+          </w:p>
+        </w:tc>
+        <w:tc>
+          <w:tcPr>
+            <w:tcW w:w="0" w:type="auto"/>
+            <w:vAlign w:val="center"/>
+          </w:tcPr>
+          <w:p>
+            <w:pPr>
+              <w:jc w:val="center"/>
+              <w:cnfStyle w:val="000000000000" w:firstRow="0" w:lastRow="0" w:firstColumn="0" w:lastColumn="0" w:oddVBand="0" w:evenVBand="0" w:oddHBand="0" w:evenHBand="0" w:firstRowFirstColumn="0" w:firstRowLastColumn="0" w:lastRowFirstColumn="0" w:lastRowLastColumn="0"/>
+            </w:pPr>
+          </w:p>
+        </w:tc>
+      </w:tr>
+      <w:tr>
+        <w:trPr>
+          <w:cnfStyle w:val="000000100000" w:firstRow="0" w:lastRow="0" w:firstColumn="0" w:lastColumn="0" w:oddVBand="0" w:evenVBand="0" w:oddHBand="1" w:evenHBand="0" w:firstRowFirstColumn="0" w:firstRowLastColumn="0" w:lastRowFirstColumn="0" w:lastRowLastColumn="0"/>
+          <w:jc w:val="center"/>
+        </w:trPr>
+        <w:tc>
+          <w:tcPr>
+            <w:cnfStyle w:val="001000000000" w:firstRow="0" w:lastRow="0" w:firstColumn="1" w:lastColumn="0" w:oddVBand="0" w:evenVBand="0" w:oddHBand="0" w:evenHBand="0" w:firstRowFirstColumn="0" w:firstRowLastColumn="0" w:lastRowFirstColumn="0" w:lastRowLastColumn="0"/>
+            <w:tcW w:w="0" w:type="auto"/>
+          </w:tcPr>
+          <w:p>
+            <w:pPr>
+              <w:jc w:val="center"/>
+            </w:pPr>
+            <w:r>
+              <w:t>26/02/2024</w:t>
+            </w:r>
+          </w:p>
+        </w:tc>
+        <w:tc>
+          <w:tcPr>
+            <w:tcW w:w="0" w:type="auto"/>
+            <w:vAlign w:val="center"/>
+          </w:tcPr>
+          <w:p>
+            <w:pPr>
+              <w:jc w:val="center"/>
+              <w:cnfStyle w:val="000000100000" w:firstRow="0" w:lastRow="0" w:firstColumn="0" w:lastColumn="0" w:oddVBand="0" w:evenVBand="0" w:oddHBand="1" w:evenHBand="0" w:firstRowFirstColumn="0" w:firstRowLastColumn="0" w:lastRowFirstColumn="0" w:lastRowLastColumn="0"/>
+            </w:pPr>
+            <w:r>
+              <w:t>Manual de Usuario</w:t>
+            </w:r>
+          </w:p>
+        </w:tc>
+        <w:tc>
+          <w:tcPr>
+            <w:tcW w:w="0" w:type="auto"/>
+            <w:vAlign w:val="center"/>
+          </w:tcPr>
+          <w:p>
+            <w:pPr>
+              <w:jc w:val="center"/>
+              <w:cnfStyle w:val="000000100000" w:firstRow="0" w:lastRow="0" w:firstColumn="0" w:lastColumn="0" w:oddVBand="0" w:evenVBand="0" w:oddHBand="1" w:evenHBand="0" w:firstRowFirstColumn="0" w:firstRowLastColumn="0" w:lastRowFirstColumn="0" w:lastRowLastColumn="0"/>
+            </w:pPr>
+            <w:r>
+              <w:t>Documentación</w:t>
+            </w:r>
+          </w:p>
+        </w:tc>
+      </w:tr>
     </w:tbl>
     <w:p>
       <w:pPr>
@@ -2327,6 +2618,9 @@
           <w:docGrid w:linePitch="360"/>
         </w:sectPr>
       </w:pPr>
+      <w:r>
+        <w:t>a</w:t>
+      </w:r>
     </w:p>
     <w:tbl>
       <w:tblPr>
@@ -2973,11 +3267,9 @@
             <w:r>
               <w:t xml:space="preserve">Visualización de catálogo de </w:t>
             </w:r>
-            <w:proofErr w:type="spellStart"/>
-            <w:r>
-              <w:t>peliculas</w:t>
-            </w:r>
-            <w:proofErr w:type="spellEnd"/>
+            <w:r>
+              <w:t>películas</w:t>
+            </w:r>
           </w:p>
         </w:tc>
         <w:tc>

</xml_diff>